<commit_message>
Worked on addressing reviewers' comments
</commit_message>
<xml_diff>
--- a/Manuscript/Quantitative Plant Biology/Second submission/Manuscript.docx
+++ b/Manuscript/Quantitative Plant Biology/Second submission/Manuscript.docx
@@ -1563,7 +1563,145 @@
         <w:rPr>
           <w:rFonts w:ascii="Times New Roman" w:hAnsi="Times New Roman" w:cs="Times New Roman"/>
         </w:rPr>
-        <w:t>Here I aim to formalise the theory of detrital photosynthesis in the hope that it will provide a better model for understanding plant decomposition at large. To address this aim, I first conducted a brief ex situ decomposition experiment on seagrasses to fill the knowledge gap on seagrass detrital photosynthesis. I chose the paddle weed</w:t>
+        <w:t xml:space="preserve">Here I </w:t>
+      </w:r>
+      <w:r>
+        <w:rPr>
+          <w:rFonts w:ascii="Times New Roman" w:hAnsi="Times New Roman" w:cs="Times New Roman"/>
+        </w:rPr>
+        <w:t xml:space="preserve">approach </w:t>
+      </w:r>
+      <w:r>
+        <w:rPr>
+          <w:rFonts w:ascii="Times New Roman" w:hAnsi="Times New Roman" w:cs="Times New Roman"/>
+        </w:rPr>
+        <w:t xml:space="preserve">detrital photosynthesis </w:t>
+      </w:r>
+      <w:r>
+        <w:rPr>
+          <w:rFonts w:ascii="Times New Roman" w:hAnsi="Times New Roman" w:cs="Times New Roman"/>
+        </w:rPr>
+        <w:t xml:space="preserve">holistically for the first time </w:t>
+      </w:r>
+      <w:r>
+        <w:rPr>
+          <w:rFonts w:ascii="Times New Roman" w:hAnsi="Times New Roman" w:cs="Times New Roman"/>
+        </w:rPr>
+        <w:t>with the</w:t>
+      </w:r>
+      <w:r>
+        <w:rPr>
+          <w:rFonts w:ascii="Times New Roman" w:hAnsi="Times New Roman" w:cs="Times New Roman"/>
+        </w:rPr>
+        <w:t xml:space="preserve"> </w:t>
+      </w:r>
+      <w:r>
+        <w:rPr>
+          <w:rFonts w:ascii="Times New Roman" w:hAnsi="Times New Roman" w:cs="Times New Roman"/>
+        </w:rPr>
+        <w:t xml:space="preserve">aim </w:t>
+      </w:r>
+      <w:r>
+        <w:rPr>
+          <w:rFonts w:ascii="Times New Roman" w:hAnsi="Times New Roman" w:cs="Times New Roman"/>
+        </w:rPr>
+        <w:t>of</w:t>
+      </w:r>
+      <w:r>
+        <w:rPr>
+          <w:rFonts w:ascii="Times New Roman" w:hAnsi="Times New Roman" w:cs="Times New Roman"/>
+        </w:rPr>
+        <w:t xml:space="preserve"> </w:t>
+      </w:r>
+      <w:r>
+        <w:rPr>
+          <w:rFonts w:ascii="Times New Roman" w:hAnsi="Times New Roman" w:cs="Times New Roman"/>
+        </w:rPr>
+        <w:t>formalis</w:t>
+      </w:r>
+      <w:r>
+        <w:rPr>
+          <w:rFonts w:ascii="Times New Roman" w:hAnsi="Times New Roman" w:cs="Times New Roman"/>
+        </w:rPr>
+        <w:t>ing</w:t>
+      </w:r>
+      <w:r>
+        <w:rPr>
+          <w:rFonts w:ascii="Times New Roman" w:hAnsi="Times New Roman" w:cs="Times New Roman"/>
+        </w:rPr>
+        <w:t xml:space="preserve"> </w:t>
+      </w:r>
+      <w:r>
+        <w:rPr>
+          <w:rFonts w:ascii="Times New Roman" w:hAnsi="Times New Roman" w:cs="Times New Roman"/>
+        </w:rPr>
+        <w:t xml:space="preserve">its </w:t>
+      </w:r>
+      <w:r>
+        <w:rPr>
+          <w:rFonts w:ascii="Times New Roman" w:hAnsi="Times New Roman" w:cs="Times New Roman"/>
+        </w:rPr>
+        <w:t>theory</w:t>
+      </w:r>
+      <w:r>
+        <w:rPr>
+          <w:rFonts w:ascii="Times New Roman" w:hAnsi="Times New Roman" w:cs="Times New Roman"/>
+        </w:rPr>
+        <w:t>.</w:t>
+      </w:r>
+      <w:r>
+        <w:rPr>
+          <w:rFonts w:ascii="Times New Roman" w:hAnsi="Times New Roman" w:cs="Times New Roman"/>
+        </w:rPr>
+        <w:t xml:space="preserve"> </w:t>
+      </w:r>
+      <w:r>
+        <w:rPr>
+          <w:rFonts w:ascii="Times New Roman" w:hAnsi="Times New Roman" w:cs="Times New Roman"/>
+        </w:rPr>
+        <w:t>I</w:t>
+      </w:r>
+      <w:r>
+        <w:rPr>
+          <w:rFonts w:ascii="Times New Roman" w:hAnsi="Times New Roman" w:cs="Times New Roman"/>
+        </w:rPr>
+        <w:t xml:space="preserve"> hope that </w:t>
+      </w:r>
+      <w:r>
+        <w:rPr>
+          <w:rFonts w:ascii="Times New Roman" w:hAnsi="Times New Roman" w:cs="Times New Roman"/>
+        </w:rPr>
+        <w:t>this</w:t>
+      </w:r>
+      <w:r>
+        <w:rPr>
+          <w:rFonts w:ascii="Times New Roman" w:hAnsi="Times New Roman" w:cs="Times New Roman"/>
+        </w:rPr>
+        <w:t xml:space="preserve"> will provide a better </w:t>
+      </w:r>
+      <w:r>
+        <w:rPr>
+          <w:rFonts w:ascii="Times New Roman" w:hAnsi="Times New Roman" w:cs="Times New Roman"/>
+        </w:rPr>
+        <w:t>conceptual foundation</w:t>
+      </w:r>
+      <w:r>
+        <w:rPr>
+          <w:rFonts w:ascii="Times New Roman" w:hAnsi="Times New Roman" w:cs="Times New Roman"/>
+        </w:rPr>
+        <w:t xml:space="preserve"> for </w:t>
+      </w:r>
+      <w:r>
+        <w:rPr>
+          <w:rFonts w:ascii="Times New Roman" w:hAnsi="Times New Roman" w:cs="Times New Roman"/>
+        </w:rPr>
+        <w:t>the investigation of</w:t>
+      </w:r>
+      <w:r>
+        <w:rPr>
+          <w:rFonts w:ascii="Times New Roman" w:hAnsi="Times New Roman" w:cs="Times New Roman"/>
+        </w:rPr>
+        <w:t xml:space="preserve"> plant decomposition at large. To address this aim, I first conducted a brief ex situ decomposition experiment on seagrasses to fill the knowledge gap on seagrass detrital photosynthesis. I chose the paddle weed</w:t>
       </w:r>
       <w:r>
         <w:rPr>
@@ -1707,6 +1845,12 @@
         <w:rPr>
           <w:rFonts w:ascii="Times New Roman" w:hAnsi="Times New Roman" w:cs="Times New Roman"/>
         </w:rPr>
+        <w:t xml:space="preserve">(e.g. </w:t>
+      </w:r>
+      <w:r>
+        <w:rPr>
+          <w:rFonts w:ascii="Times New Roman" w:hAnsi="Times New Roman" w:cs="Times New Roman"/>
+        </w:rPr>
         <w:fldChar w:fldCharType="begin"/>
       </w:r>
       <w:r>
@@ -1725,7 +1869,7 @@
         <w:rPr>
           <w:rFonts w:ascii="Times New Roman" w:hAnsi="Times New Roman" w:cs="Times New Roman"/>
         </w:rPr>
-        <w:t>(Wright et al. 2022, 2024)</w:t>
+        <w:t>Wright et al. 2022, 2024)</w:t>
       </w:r>
       <w:r>
         <w:rPr>
@@ -1773,7 +1917,19 @@
         <w:rPr>
           <w:rFonts w:ascii="Times New Roman" w:hAnsi="Times New Roman" w:cs="Times New Roman"/>
         </w:rPr>
-        <w:t xml:space="preserve">, I used this model in a Bayesian meta-analysis to infer the longevity of detrital photosynthesis for different plants and quantify the effects of light and choice of response variable (photosynthesis vs. chlorophyll). Finally, I compared the persistence of detrital photosynthesis with detrital half-life </w:t>
+        <w:t>, I used this model in a Bayesian meta-analysis to infer the longevity of detrital photosynthesis for different plants and quantify the effects of light and choice of response variable (photosynthesis vs. chlorophyll). Finally, I compared the persistence of detrital photosynthesis with detrital half-life</w:t>
+      </w:r>
+      <w:r>
+        <w:rPr>
+          <w:rFonts w:ascii="Times New Roman" w:hAnsi="Times New Roman" w:cs="Times New Roman"/>
+        </w:rPr>
+        <w:t xml:space="preserve"> (sensu</w:t>
+      </w:r>
+      <w:r>
+        <w:rPr>
+          <w:rFonts w:ascii="Times New Roman" w:hAnsi="Times New Roman" w:cs="Times New Roman"/>
+        </w:rPr>
+        <w:t xml:space="preserve"> </w:t>
       </w:r>
       <w:r>
         <w:rPr>
@@ -1797,7 +1953,7 @@
         <w:rPr>
           <w:rFonts w:ascii="Times New Roman" w:hAnsi="Times New Roman" w:cs="Times New Roman"/>
         </w:rPr>
-        <w:t>(Olson 1963)</w:t>
+        <w:t>Olson 1963)</w:t>
       </w:r>
       <w:r>
         <w:rPr>
@@ -1944,7 +2100,19 @@
           <w:rFonts w:ascii="Times New Roman" w:hAnsi="Times New Roman" w:cs="Times New Roman"/>
         </w:rPr>
         <w:lastRenderedPageBreak/>
-        <w:t xml:space="preserve">Detached plant parts can remain in limbo for long durations, often photosynthesising near baseline levels. For this reason and for simplicity detrital photosynthesis has mostly been described as a linear function of detrital age </w:t>
+        <w:t>Detached plant parts can remain in limbo for long durations, often photosynthesising near baseline levels. For this reason and for simplicity</w:t>
+      </w:r>
+      <w:r>
+        <w:rPr>
+          <w:rFonts w:ascii="Times New Roman" w:hAnsi="Times New Roman" w:cs="Times New Roman"/>
+        </w:rPr>
+        <w:t>,</w:t>
+      </w:r>
+      <w:r>
+        <w:rPr>
+          <w:rFonts w:ascii="Times New Roman" w:hAnsi="Times New Roman" w:cs="Times New Roman"/>
+        </w:rPr>
+        <w:t xml:space="preserve"> detrital photosynthesis has mostly been described as a linear function of detrital age </w:t>
       </w:r>
       <w:r>
         <w:rPr>
@@ -2066,7 +2234,43 @@
         <w:rPr>
           <w:rFonts w:ascii="Times New Roman" w:hAnsi="Times New Roman" w:cs="Times New Roman"/>
         </w:rPr>
-        <w:t xml:space="preserve"> with time after excision. The logistic function describes the decay of photosynthesis after detachment better than the linear function because it is bounded. Detrital photosynthesis cannot conceivably exceed baseline photosynthesis under identical conditions. An ill-defined baseline or changes in light, temperature, carbon, nutrients etc. may naturally lead to brief increases after detachment </w:t>
+        <w:t xml:space="preserve"> with time after excision. The logistic function describes the decay of photosynthesis after detachment better than the linear function because it is bounded. Detrital photosynthesis cannot conceivably exceed baseline photosynthesis under identical conditions. An ill-defined baseline or changes in </w:t>
+      </w:r>
+      <w:r>
+        <w:rPr>
+          <w:rFonts w:ascii="Times New Roman" w:hAnsi="Times New Roman" w:cs="Times New Roman"/>
+        </w:rPr>
+        <w:t>environment</w:t>
+      </w:r>
+      <w:r>
+        <w:rPr>
+          <w:rFonts w:ascii="Times New Roman" w:hAnsi="Times New Roman" w:cs="Times New Roman"/>
+        </w:rPr>
+        <w:t xml:space="preserve"> </w:t>
+      </w:r>
+      <w:r>
+        <w:rPr>
+          <w:rFonts w:ascii="Times New Roman" w:hAnsi="Times New Roman" w:cs="Times New Roman"/>
+        </w:rPr>
+        <w:t xml:space="preserve">(e.g. when </w:t>
+      </w:r>
+      <w:r>
+        <w:rPr>
+          <w:rFonts w:ascii="Times New Roman" w:hAnsi="Times New Roman" w:cs="Times New Roman"/>
+        </w:rPr>
+        <w:t>detritus</w:t>
+      </w:r>
+      <w:r>
+        <w:rPr>
+          <w:rFonts w:ascii="Times New Roman" w:hAnsi="Times New Roman" w:cs="Times New Roman"/>
+        </w:rPr>
+        <w:t xml:space="preserve"> floats and is exposed to more light) </w:t>
+      </w:r>
+      <w:r>
+        <w:rPr>
+          <w:rFonts w:ascii="Times New Roman" w:hAnsi="Times New Roman" w:cs="Times New Roman"/>
+        </w:rPr>
+        <w:t xml:space="preserve">may naturally lead to brief increases after detachment </w:t>
       </w:r>
       <w:r>
         <w:rPr>
@@ -2102,7 +2306,61 @@
         <w:rPr>
           <w:rFonts w:ascii="Times New Roman" w:hAnsi="Times New Roman" w:cs="Times New Roman"/>
         </w:rPr>
-        <w:t>, but this cannot be considered part of the underlying process of interest. Similarly, photosynthesis cannot decline beyond a set minimum, which is zero for most response variables (e.g. gross photosynthesis, chlorophyll fluorescence and chlorophyll) and a negative constant for net photosynthesis. Hence the logistic function is the natural choice.</w:t>
+        <w:t>.</w:t>
+      </w:r>
+      <w:r>
+        <w:rPr>
+          <w:rFonts w:ascii="Times New Roman" w:hAnsi="Times New Roman" w:cs="Times New Roman"/>
+        </w:rPr>
+        <w:t xml:space="preserve"> </w:t>
+      </w:r>
+      <w:r>
+        <w:rPr>
+          <w:rFonts w:ascii="Times New Roman" w:hAnsi="Times New Roman" w:cs="Times New Roman"/>
+        </w:rPr>
+        <w:t>However,</w:t>
+      </w:r>
+      <w:r>
+        <w:rPr>
+          <w:rFonts w:ascii="Times New Roman" w:hAnsi="Times New Roman" w:cs="Times New Roman"/>
+        </w:rPr>
+        <w:t xml:space="preserve"> this cannot be considered part of the underlying </w:t>
+      </w:r>
+      <w:r>
+        <w:rPr>
+          <w:rFonts w:ascii="Times New Roman" w:hAnsi="Times New Roman" w:cs="Times New Roman"/>
+        </w:rPr>
+        <w:t xml:space="preserve">photosynthetic decay </w:t>
+      </w:r>
+      <w:r>
+        <w:rPr>
+          <w:rFonts w:ascii="Times New Roman" w:hAnsi="Times New Roman" w:cs="Times New Roman"/>
+        </w:rPr>
+        <w:t xml:space="preserve">process of interest. Similarly, photosynthesis cannot decline beyond a set minimum, which is zero for most response variables (e.g. gross photosynthesis, chlorophyll fluorescence and chlorophyll) and a negative constant for net photosynthesis. </w:t>
+      </w:r>
+      <w:r>
+        <w:rPr>
+          <w:rFonts w:ascii="Times New Roman" w:hAnsi="Times New Roman" w:cs="Times New Roman"/>
+        </w:rPr>
+        <w:t>T</w:t>
+      </w:r>
+      <w:r>
+        <w:rPr>
+          <w:rFonts w:ascii="Times New Roman" w:hAnsi="Times New Roman" w:cs="Times New Roman"/>
+        </w:rPr>
+        <w:t xml:space="preserve">he logistic function is </w:t>
+      </w:r>
+      <w:r>
+        <w:rPr>
+          <w:rFonts w:ascii="Times New Roman" w:hAnsi="Times New Roman" w:cs="Times New Roman"/>
+        </w:rPr>
+        <w:t xml:space="preserve">therefore </w:t>
+      </w:r>
+      <w:r>
+        <w:rPr>
+          <w:rFonts w:ascii="Times New Roman" w:hAnsi="Times New Roman" w:cs="Times New Roman"/>
+        </w:rPr>
+        <w:t>the natural choice.</w:t>
       </w:r>
     </w:p>
     <w:p>
@@ -4363,7 +4621,27 @@
         <w:rPr>
           <w:rFonts w:ascii="Times New Roman" w:hAnsi="Times New Roman" w:cs="Times New Roman"/>
         </w:rPr>
-        <w:t xml:space="preserve"> (days), the main predictor variables of interest are plant group (terrestrial plants, freshwater plants, seagrasses</w:t>
+        <w:t xml:space="preserve"> (days), the main predictor variables of interest are plant group (</w:t>
+      </w:r>
+      <w:r>
+        <w:rPr>
+          <w:rFonts w:ascii="Times New Roman" w:hAnsi="Times New Roman" w:cs="Times New Roman"/>
+          <w:i/>
+          <w:iCs/>
+        </w:rPr>
+        <w:t>G</w:t>
+      </w:r>
+      <w:r>
+        <w:rPr>
+          <w:rFonts w:ascii="Times New Roman" w:hAnsi="Times New Roman" w:cs="Times New Roman"/>
+        </w:rPr>
+        <w:t xml:space="preserve"> = </w:t>
+      </w:r>
+      <w:r>
+        <w:rPr>
+          <w:rFonts w:ascii="Times New Roman" w:hAnsi="Times New Roman" w:cs="Times New Roman"/>
+        </w:rPr>
+        <w:t>terrestrial plants, freshwater plants, seagrasses</w:t>
       </w:r>
       <w:r>
         <w:rPr>
@@ -4435,7 +4713,55 @@
         <w:rPr>
           <w:rFonts w:ascii="Times New Roman" w:hAnsi="Times New Roman" w:cs="Times New Roman"/>
         </w:rPr>
-        <w:t xml:space="preserve">. Water availability is only relevant to terrestrial plants and was therefore not considered. Since light availability and the type of response variable are binary predictors, they were coded as indicators of light (−0.5 for dark, +0.5 for light) and chlorophyll (−0.5 for photosynthesis, +0.5 for chlorophyll), centred on zero to avoid the bias in prior variance typical of indicator variables </w:t>
+        <w:t>. Water availability is only relevant to terrestrial plants and was therefore not considered. Since light availability and the type of response variable are binary predictors, they were coded as indicators of light (</w:t>
+      </w:r>
+      <w:r>
+        <w:rPr>
+          <w:rFonts w:ascii="Times New Roman" w:hAnsi="Times New Roman" w:cs="Times New Roman"/>
+          <w:i/>
+          <w:iCs/>
+        </w:rPr>
+        <w:t>L</w:t>
+      </w:r>
+      <w:r>
+        <w:rPr>
+          <w:rFonts w:ascii="Times New Roman" w:hAnsi="Times New Roman" w:cs="Times New Roman"/>
+          <w:i/>
+          <w:iCs/>
+        </w:rPr>
+        <w:t xml:space="preserve"> </w:t>
+      </w:r>
+      <w:r>
+        <w:rPr>
+          <w:rFonts w:ascii="Times New Roman" w:hAnsi="Times New Roman" w:cs="Times New Roman"/>
+        </w:rPr>
+        <w:t xml:space="preserve">= </w:t>
+      </w:r>
+      <w:r>
+        <w:rPr>
+          <w:rFonts w:ascii="Times New Roman" w:hAnsi="Times New Roman" w:cs="Times New Roman"/>
+        </w:rPr>
+        <w:t>−0.5 for dark, +0.5 for light) and chlorophyll (</w:t>
+      </w:r>
+      <w:r>
+        <w:rPr>
+          <w:rFonts w:ascii="Times New Roman" w:hAnsi="Times New Roman" w:cs="Times New Roman"/>
+          <w:i/>
+          <w:iCs/>
+        </w:rPr>
+        <w:t>C</w:t>
+      </w:r>
+      <w:r>
+        <w:rPr>
+          <w:rFonts w:ascii="Times New Roman" w:hAnsi="Times New Roman" w:cs="Times New Roman"/>
+        </w:rPr>
+        <w:t xml:space="preserve"> = </w:t>
+      </w:r>
+      <w:r>
+        <w:rPr>
+          <w:rFonts w:ascii="Times New Roman" w:hAnsi="Times New Roman" w:cs="Times New Roman"/>
+        </w:rPr>
+        <w:t xml:space="preserve">−0.5 for photosynthesis, +0.5 for chlorophyll), centred on zero to avoid the bias in prior variance typical of indicator variables </w:t>
       </w:r>
       <w:r>
         <w:rPr>
@@ -4471,14 +4797,54 @@
         <w:rPr>
           <w:rFonts w:ascii="Times New Roman" w:hAnsi="Times New Roman" w:cs="Times New Roman"/>
         </w:rPr>
-        <w:t xml:space="preserve"> and allow easy prediction of the mean. To get a sense of interspecific and </w:t>
+        <w:t xml:space="preserve"> and allow easy prediction of the mean. To get a sense of interspecific and experimental variation, I also included plant species (</w:t>
+      </w:r>
+      <w:r>
+        <w:rPr>
+          <w:rFonts w:ascii="Times New Roman" w:hAnsi="Times New Roman" w:cs="Times New Roman"/>
+          <w:i/>
+          <w:iCs/>
+        </w:rPr>
+        <w:t>S</w:t>
+      </w:r>
+      <w:r>
+        <w:rPr>
+          <w:rFonts w:ascii="Times New Roman" w:hAnsi="Times New Roman" w:cs="Times New Roman"/>
+        </w:rPr>
+        <w:t xml:space="preserve">, </w:t>
+      </w:r>
+      <w:r>
+        <w:rPr>
+          <w:rFonts w:ascii="Times New Roman" w:hAnsi="Times New Roman" w:cs="Times New Roman"/>
+        </w:rPr>
+        <w:t xml:space="preserve">92 levels) and </w:t>
       </w:r>
       <w:r>
         <w:rPr>
           <w:rFonts w:ascii="Times New Roman" w:hAnsi="Times New Roman" w:cs="Times New Roman"/>
         </w:rPr>
         <w:lastRenderedPageBreak/>
-        <w:t>experimental variation, I also included plant species (92 levels) and experiment (551 levels) as predictors. The resulting Bayesian log-normal multilevel model of relative photosynthesis (</w:t>
+        <w:t>experiment (</w:t>
+      </w:r>
+      <w:r>
+        <w:rPr>
+          <w:rFonts w:ascii="Times New Roman" w:hAnsi="Times New Roman" w:cs="Times New Roman"/>
+          <w:i/>
+          <w:iCs/>
+        </w:rPr>
+        <w:t>E</w:t>
+      </w:r>
+      <w:r>
+        <w:rPr>
+          <w:rFonts w:ascii="Times New Roman" w:hAnsi="Times New Roman" w:cs="Times New Roman"/>
+        </w:rPr>
+        <w:t xml:space="preserve">, </w:t>
+      </w:r>
+      <w:r>
+        <w:rPr>
+          <w:rFonts w:ascii="Times New Roman" w:hAnsi="Times New Roman" w:cs="Times New Roman"/>
+        </w:rPr>
+        <w:t>551 levels) as predictors. The resulting Bayesian log-normal multilevel model of relative photosynthesis (</w:t>
       </w:r>
       <w:r>
         <w:rPr>
@@ -4535,12 +4901,32 @@
             </m:r>
           </m:fName>
           <m:e>
-            <m:r>
-              <w:rPr>
-                <w:rFonts w:ascii="Cambria Math" w:hAnsi="Cambria Math" w:cs="Times New Roman"/>
-              </w:rPr>
-              <m:t>p</m:t>
-            </m:r>
+            <m:sSub>
+              <m:sSubPr>
+                <m:ctrlPr>
+                  <w:rPr>
+                    <w:rFonts w:ascii="Cambria Math" w:hAnsi="Cambria Math" w:cs="Times New Roman"/>
+                    <w:i/>
+                  </w:rPr>
+                </m:ctrlPr>
+              </m:sSubPr>
+              <m:e>
+                <m:r>
+                  <w:rPr>
+                    <w:rFonts w:ascii="Cambria Math" w:hAnsi="Cambria Math" w:cs="Times New Roman"/>
+                  </w:rPr>
+                  <m:t>p</m:t>
+                </m:r>
+              </m:e>
+              <m:sub>
+                <m:r>
+                  <w:rPr>
+                    <w:rFonts w:ascii="Cambria Math" w:hAnsi="Cambria Math" w:cs="Times New Roman"/>
+                  </w:rPr>
+                  <m:t>i</m:t>
+                </m:r>
+              </m:sub>
+            </m:sSub>
           </m:e>
         </m:func>
         <m:r>
@@ -4564,25 +4950,45 @@
           </w:rPr>
           <m:t xml:space="preserve">( </m:t>
         </m:r>
-        <m:acc>
-          <m:accPr>
-            <m:chr m:val="̅"/>
+        <m:sSub>
+          <m:sSubPr>
             <m:ctrlPr>
               <w:rPr>
                 <w:rFonts w:ascii="Cambria Math" w:eastAsiaTheme="minorEastAsia" w:hAnsi="Cambria Math" w:cs="Times New Roman"/>
                 <w:i/>
               </w:rPr>
             </m:ctrlPr>
-          </m:accPr>
+          </m:sSubPr>
           <m:e>
+            <m:acc>
+              <m:accPr>
+                <m:chr m:val="̅"/>
+                <m:ctrlPr>
+                  <w:rPr>
+                    <w:rFonts w:ascii="Cambria Math" w:eastAsiaTheme="minorEastAsia" w:hAnsi="Cambria Math" w:cs="Times New Roman"/>
+                    <w:i/>
+                  </w:rPr>
+                </m:ctrlPr>
+              </m:accPr>
+              <m:e>
+                <m:r>
+                  <w:rPr>
+                    <w:rFonts w:ascii="Cambria Math" w:eastAsiaTheme="minorEastAsia" w:hAnsi="Cambria Math" w:cs="Times New Roman"/>
+                  </w:rPr>
+                  <m:t>p</m:t>
+                </m:r>
+              </m:e>
+            </m:acc>
+          </m:e>
+          <m:sub>
             <m:r>
               <w:rPr>
                 <w:rFonts w:ascii="Cambria Math" w:eastAsiaTheme="minorEastAsia" w:hAnsi="Cambria Math" w:cs="Times New Roman"/>
               </w:rPr>
-              <m:t>p</m:t>
+              <m:t>i</m:t>
             </m:r>
-          </m:e>
-        </m:acc>
+          </m:sub>
+        </m:sSub>
         <m:r>
           <w:rPr>
             <w:rFonts w:ascii="Cambria Math" w:eastAsiaTheme="minorEastAsia" w:hAnsi="Cambria Math" w:cs="Times New Roman"/>
@@ -4609,25 +5015,45 @@
         </w:rPr>
       </w:pPr>
       <m:oMath>
-        <m:acc>
-          <m:accPr>
-            <m:chr m:val="̅"/>
+        <m:sSub>
+          <m:sSubPr>
             <m:ctrlPr>
               <w:rPr>
                 <w:rFonts w:ascii="Cambria Math" w:eastAsiaTheme="minorEastAsia" w:hAnsi="Cambria Math" w:cs="Times New Roman"/>
                 <w:i/>
               </w:rPr>
             </m:ctrlPr>
-          </m:accPr>
+          </m:sSubPr>
           <m:e>
+            <m:acc>
+              <m:accPr>
+                <m:chr m:val="̅"/>
+                <m:ctrlPr>
+                  <w:rPr>
+                    <w:rFonts w:ascii="Cambria Math" w:eastAsiaTheme="minorEastAsia" w:hAnsi="Cambria Math" w:cs="Times New Roman"/>
+                    <w:i/>
+                  </w:rPr>
+                </m:ctrlPr>
+              </m:accPr>
+              <m:e>
+                <m:r>
+                  <w:rPr>
+                    <w:rFonts w:ascii="Cambria Math" w:eastAsiaTheme="minorEastAsia" w:hAnsi="Cambria Math" w:cs="Times New Roman"/>
+                  </w:rPr>
+                  <m:t>p</m:t>
+                </m:r>
+              </m:e>
+            </m:acc>
+          </m:e>
+          <m:sub>
             <m:r>
               <w:rPr>
                 <w:rFonts w:ascii="Cambria Math" w:eastAsiaTheme="minorEastAsia" w:hAnsi="Cambria Math" w:cs="Times New Roman"/>
               </w:rPr>
-              <m:t>p</m:t>
+              <m:t>i</m:t>
             </m:r>
-          </m:e>
-        </m:acc>
+          </m:sub>
+        </m:sSub>
         <m:r>
           <w:rPr>
             <w:rFonts w:ascii="Cambria Math" w:eastAsiaTheme="minorEastAsia" w:hAnsi="Cambria Math" w:cs="Times New Roman"/>
@@ -4677,7 +5103,25 @@
                   <w:rPr>
                     <w:rFonts w:ascii="Cambria Math" w:eastAsiaTheme="minorEastAsia" w:hAnsi="Cambria Math" w:cs="Times New Roman"/>
                   </w:rPr>
-                  <m:t>1+</m:t>
+                  <m:t>1</m:t>
+                </m:r>
+                <m:r>
+                  <w:rPr>
+                    <w:rFonts w:ascii="Cambria Math" w:eastAsiaTheme="minorEastAsia" w:hAnsi="Cambria Math" w:cs="Times New Roman"/>
+                  </w:rPr>
+                  <m:t xml:space="preserve"> </m:t>
+                </m:r>
+                <m:r>
+                  <w:rPr>
+                    <w:rFonts w:ascii="Cambria Math" w:eastAsiaTheme="minorEastAsia" w:hAnsi="Cambria Math" w:cs="Times New Roman"/>
+                  </w:rPr>
+                  <m:t>+</m:t>
+                </m:r>
+                <m:r>
+                  <w:rPr>
+                    <w:rFonts w:ascii="Cambria Math" w:eastAsiaTheme="minorEastAsia" w:hAnsi="Cambria Math" w:cs="Times New Roman"/>
+                  </w:rPr>
+                  <m:t xml:space="preserve"> </m:t>
                 </m:r>
                 <m:sSup>
                   <m:sSupPr>
@@ -4711,16 +5155,100 @@
                           <w:rPr>
                             <w:rFonts w:ascii="Cambria Math" w:hAnsi="Cambria Math" w:cs="Times New Roman"/>
                           </w:rPr>
-                          <m:t>5(t - μ)</m:t>
+                          <m:t>5(</m:t>
                         </m:r>
-                      </m:num>
-                      <m:den>
+                        <m:sSub>
+                          <m:sSubPr>
+                            <m:ctrlPr>
+                              <w:rPr>
+                                <w:rFonts w:ascii="Cambria Math" w:hAnsi="Cambria Math" w:cs="Times New Roman"/>
+                                <w:i/>
+                              </w:rPr>
+                            </m:ctrlPr>
+                          </m:sSubPr>
+                          <m:e>
+                            <m:r>
+                              <w:rPr>
+                                <w:rFonts w:ascii="Cambria Math" w:hAnsi="Cambria Math" w:cs="Times New Roman"/>
+                              </w:rPr>
+                              <m:t>t</m:t>
+                            </m:r>
+                          </m:e>
+                          <m:sub>
+                            <m:r>
+                              <w:rPr>
+                                <w:rFonts w:ascii="Cambria Math" w:hAnsi="Cambria Math" w:cs="Times New Roman"/>
+                              </w:rPr>
+                              <m:t>i</m:t>
+                            </m:r>
+                          </m:sub>
+                        </m:sSub>
                         <m:r>
                           <w:rPr>
                             <w:rFonts w:ascii="Cambria Math" w:hAnsi="Cambria Math" w:cs="Times New Roman"/>
                           </w:rPr>
-                          <m:t>μ</m:t>
+                          <m:t xml:space="preserve"> - </m:t>
                         </m:r>
+                        <m:sSub>
+                          <m:sSubPr>
+                            <m:ctrlPr>
+                              <w:rPr>
+                                <w:rFonts w:ascii="Cambria Math" w:hAnsi="Cambria Math" w:cs="Times New Roman"/>
+                                <w:i/>
+                              </w:rPr>
+                            </m:ctrlPr>
+                          </m:sSubPr>
+                          <m:e>
+                            <m:r>
+                              <w:rPr>
+                                <w:rFonts w:ascii="Cambria Math" w:hAnsi="Cambria Math" w:cs="Times New Roman"/>
+                              </w:rPr>
+                              <m:t>μ</m:t>
+                            </m:r>
+                          </m:e>
+                          <m:sub>
+                            <m:r>
+                              <w:rPr>
+                                <w:rFonts w:ascii="Cambria Math" w:hAnsi="Cambria Math" w:cs="Times New Roman"/>
+                              </w:rPr>
+                              <m:t>i</m:t>
+                            </m:r>
+                          </m:sub>
+                        </m:sSub>
+                        <m:r>
+                          <w:rPr>
+                            <w:rFonts w:ascii="Cambria Math" w:hAnsi="Cambria Math" w:cs="Times New Roman"/>
+                          </w:rPr>
+                          <m:t>)</m:t>
+                        </m:r>
+                      </m:num>
+                      <m:den>
+                        <m:sSub>
+                          <m:sSubPr>
+                            <m:ctrlPr>
+                              <w:rPr>
+                                <w:rFonts w:ascii="Cambria Math" w:hAnsi="Cambria Math" w:cs="Times New Roman"/>
+                                <w:i/>
+                              </w:rPr>
+                            </m:ctrlPr>
+                          </m:sSubPr>
+                          <m:e>
+                            <m:r>
+                              <w:rPr>
+                                <w:rFonts w:ascii="Cambria Math" w:hAnsi="Cambria Math" w:cs="Times New Roman"/>
+                              </w:rPr>
+                              <m:t>μ</m:t>
+                            </m:r>
+                          </m:e>
+                          <m:sub>
+                            <m:r>
+                              <w:rPr>
+                                <w:rFonts w:ascii="Cambria Math" w:hAnsi="Cambria Math" w:cs="Times New Roman"/>
+                              </w:rPr>
+                              <m:t>i</m:t>
+                            </m:r>
+                          </m:sub>
+                        </m:sSub>
                       </m:den>
                     </m:f>
                   </m:sup>
@@ -4769,12 +5297,32 @@
             </m:r>
           </m:fName>
           <m:e>
-            <m:r>
-              <w:rPr>
-                <w:rFonts w:ascii="Cambria Math" w:eastAsiaTheme="minorEastAsia" w:hAnsi="Cambria Math" w:cs="Times New Roman"/>
-              </w:rPr>
-              <m:t>μ</m:t>
-            </m:r>
+            <m:sSub>
+              <m:sSubPr>
+                <m:ctrlPr>
+                  <w:rPr>
+                    <w:rFonts w:ascii="Cambria Math" w:hAnsi="Cambria Math" w:cs="Times New Roman"/>
+                    <w:i/>
+                  </w:rPr>
+                </m:ctrlPr>
+              </m:sSubPr>
+              <m:e>
+                <m:r>
+                  <w:rPr>
+                    <w:rFonts w:ascii="Cambria Math" w:hAnsi="Cambria Math" w:cs="Times New Roman"/>
+                  </w:rPr>
+                  <m:t>μ</m:t>
+                </m:r>
+              </m:e>
+              <m:sub>
+                <m:r>
+                  <w:rPr>
+                    <w:rFonts w:ascii="Cambria Math" w:hAnsi="Cambria Math" w:cs="Times New Roman"/>
+                  </w:rPr>
+                  <m:t>i</m:t>
+                </m:r>
+              </m:sub>
+            </m:sSub>
           </m:e>
         </m:func>
         <m:r>
@@ -4801,11 +5349,213 @@
             </m:r>
           </m:e>
           <m:sub>
+            <m:sSub>
+              <m:sSubPr>
+                <m:ctrlPr>
+                  <w:rPr>
+                    <w:rFonts w:ascii="Cambria Math" w:eastAsiaTheme="minorEastAsia" w:hAnsi="Cambria Math" w:cs="Times New Roman"/>
+                    <w:i/>
+                  </w:rPr>
+                </m:ctrlPr>
+              </m:sSubPr>
+              <m:e>
+                <m:r>
+                  <w:rPr>
+                    <w:rFonts w:ascii="Cambria Math" w:eastAsiaTheme="minorEastAsia" w:hAnsi="Cambria Math" w:cs="Times New Roman"/>
+                  </w:rPr>
+                  <m:t>G</m:t>
+                </m:r>
+              </m:e>
+              <m:sub>
+                <m:r>
+                  <w:rPr>
+                    <w:rFonts w:ascii="Cambria Math" w:eastAsiaTheme="minorEastAsia" w:hAnsi="Cambria Math" w:cs="Times New Roman"/>
+                  </w:rPr>
+                  <m:t>i</m:t>
+                </m:r>
+              </m:sub>
+            </m:sSub>
+          </m:sub>
+        </m:sSub>
+        <m:r>
+          <w:rPr>
+            <w:rFonts w:ascii="Cambria Math" w:eastAsiaTheme="minorEastAsia" w:hAnsi="Cambria Math" w:cs="Times New Roman"/>
+          </w:rPr>
+          <m:t>+</m:t>
+        </m:r>
+        <m:sSub>
+          <m:sSubPr>
+            <m:ctrlPr>
+              <w:rPr>
+                <w:rFonts w:ascii="Cambria Math" w:eastAsiaTheme="minorEastAsia" w:hAnsi="Cambria Math" w:cs="Times New Roman"/>
+                <w:i/>
+              </w:rPr>
+            </m:ctrlPr>
+          </m:sSubPr>
+          <m:e>
             <m:r>
               <w:rPr>
                 <w:rFonts w:ascii="Cambria Math" w:eastAsiaTheme="minorEastAsia" w:hAnsi="Cambria Math" w:cs="Times New Roman"/>
               </w:rPr>
-              <m:t>G</m:t>
+              <m:t>α</m:t>
+            </m:r>
+          </m:e>
+          <m:sub>
+            <m:sSub>
+              <m:sSubPr>
+                <m:ctrlPr>
+                  <w:rPr>
+                    <w:rFonts w:ascii="Cambria Math" w:eastAsiaTheme="minorEastAsia" w:hAnsi="Cambria Math" w:cs="Times New Roman"/>
+                    <w:i/>
+                  </w:rPr>
+                </m:ctrlPr>
+              </m:sSubPr>
+              <m:e>
+                <m:r>
+                  <w:rPr>
+                    <w:rFonts w:ascii="Cambria Math" w:eastAsiaTheme="minorEastAsia" w:hAnsi="Cambria Math" w:cs="Times New Roman"/>
+                  </w:rPr>
+                  <m:t>S</m:t>
+                </m:r>
+              </m:e>
+              <m:sub>
+                <m:r>
+                  <w:rPr>
+                    <w:rFonts w:ascii="Cambria Math" w:eastAsiaTheme="minorEastAsia" w:hAnsi="Cambria Math" w:cs="Times New Roman"/>
+                  </w:rPr>
+                  <m:t>i</m:t>
+                </m:r>
+              </m:sub>
+            </m:sSub>
+          </m:sub>
+        </m:sSub>
+        <m:r>
+          <w:rPr>
+            <w:rFonts w:ascii="Cambria Math" w:eastAsiaTheme="minorEastAsia" w:hAnsi="Cambria Math" w:cs="Times New Roman"/>
+          </w:rPr>
+          <m:t>+</m:t>
+        </m:r>
+        <m:sSub>
+          <m:sSubPr>
+            <m:ctrlPr>
+              <w:rPr>
+                <w:rFonts w:ascii="Cambria Math" w:eastAsiaTheme="minorEastAsia" w:hAnsi="Cambria Math" w:cs="Times New Roman"/>
+                <w:i/>
+              </w:rPr>
+            </m:ctrlPr>
+          </m:sSubPr>
+          <m:e>
+            <m:r>
+              <w:rPr>
+                <w:rFonts w:ascii="Cambria Math" w:eastAsiaTheme="minorEastAsia" w:hAnsi="Cambria Math" w:cs="Times New Roman"/>
+              </w:rPr>
+              <m:t>α</m:t>
+            </m:r>
+          </m:e>
+          <m:sub>
+            <m:sSub>
+              <m:sSubPr>
+                <m:ctrlPr>
+                  <w:rPr>
+                    <w:rFonts w:ascii="Cambria Math" w:eastAsiaTheme="minorEastAsia" w:hAnsi="Cambria Math" w:cs="Times New Roman"/>
+                    <w:i/>
+                  </w:rPr>
+                </m:ctrlPr>
+              </m:sSubPr>
+              <m:e>
+                <m:r>
+                  <w:rPr>
+                    <w:rFonts w:ascii="Cambria Math" w:eastAsiaTheme="minorEastAsia" w:hAnsi="Cambria Math" w:cs="Times New Roman"/>
+                  </w:rPr>
+                  <m:t>E</m:t>
+                </m:r>
+              </m:e>
+              <m:sub>
+                <m:r>
+                  <w:rPr>
+                    <w:rFonts w:ascii="Cambria Math" w:eastAsiaTheme="minorEastAsia" w:hAnsi="Cambria Math" w:cs="Times New Roman"/>
+                  </w:rPr>
+                  <m:t>i</m:t>
+                </m:r>
+              </m:sub>
+            </m:sSub>
+          </m:sub>
+        </m:sSub>
+        <m:r>
+          <w:rPr>
+            <w:rFonts w:ascii="Cambria Math" w:eastAsiaTheme="minorEastAsia" w:hAnsi="Cambria Math" w:cs="Times New Roman"/>
+          </w:rPr>
+          <m:t>+</m:t>
+        </m:r>
+        <m:sSub>
+          <m:sSubPr>
+            <m:ctrlPr>
+              <w:rPr>
+                <w:rFonts w:ascii="Cambria Math" w:eastAsiaTheme="minorEastAsia" w:hAnsi="Cambria Math" w:cs="Times New Roman"/>
+                <w:i/>
+              </w:rPr>
+            </m:ctrlPr>
+          </m:sSubPr>
+          <m:e>
+            <m:r>
+              <w:rPr>
+                <w:rFonts w:ascii="Cambria Math" w:eastAsiaTheme="minorEastAsia" w:hAnsi="Cambria Math" w:cs="Times New Roman"/>
+              </w:rPr>
+              <m:t>β</m:t>
+            </m:r>
+          </m:e>
+          <m:sub>
+            <m:sSub>
+              <m:sSubPr>
+                <m:ctrlPr>
+                  <w:rPr>
+                    <w:rFonts w:ascii="Cambria Math" w:eastAsiaTheme="minorEastAsia" w:hAnsi="Cambria Math" w:cs="Times New Roman"/>
+                    <w:i/>
+                  </w:rPr>
+                </m:ctrlPr>
+              </m:sSubPr>
+              <m:e>
+                <m:r>
+                  <w:rPr>
+                    <w:rFonts w:ascii="Cambria Math" w:eastAsiaTheme="minorEastAsia" w:hAnsi="Cambria Math" w:cs="Times New Roman"/>
+                  </w:rPr>
+                  <m:t>G</m:t>
+                </m:r>
+              </m:e>
+              <m:sub>
+                <m:r>
+                  <w:rPr>
+                    <w:rFonts w:ascii="Cambria Math" w:eastAsiaTheme="minorEastAsia" w:hAnsi="Cambria Math" w:cs="Times New Roman"/>
+                  </w:rPr>
+                  <m:t>i</m:t>
+                </m:r>
+              </m:sub>
+            </m:sSub>
+          </m:sub>
+        </m:sSub>
+        <m:sSub>
+          <m:sSubPr>
+            <m:ctrlPr>
+              <w:rPr>
+                <w:rFonts w:ascii="Cambria Math" w:eastAsiaTheme="minorEastAsia" w:hAnsi="Cambria Math" w:cs="Times New Roman"/>
+                <w:i/>
+              </w:rPr>
+            </m:ctrlPr>
+          </m:sSubPr>
+          <m:e>
+            <m:r>
+              <w:rPr>
+                <w:rFonts w:ascii="Cambria Math" w:eastAsiaTheme="minorEastAsia" w:hAnsi="Cambria Math" w:cs="Times New Roman"/>
+              </w:rPr>
+              <m:t>L</m:t>
+            </m:r>
+          </m:e>
+          <m:sub>
+            <m:r>
+              <w:rPr>
+                <w:rFonts w:ascii="Cambria Math" w:eastAsiaTheme="minorEastAsia" w:hAnsi="Cambria Math" w:cs="Times New Roman"/>
+              </w:rPr>
+              <m:t>i</m:t>
             </m:r>
           </m:sub>
         </m:sSub>
@@ -4829,7 +5579,53 @@
               <w:rPr>
                 <w:rFonts w:ascii="Cambria Math" w:eastAsiaTheme="minorEastAsia" w:hAnsi="Cambria Math" w:cs="Times New Roman"/>
               </w:rPr>
-              <m:t>α</m:t>
+              <m:t>γ</m:t>
+            </m:r>
+          </m:e>
+          <m:sub>
+            <m:sSub>
+              <m:sSubPr>
+                <m:ctrlPr>
+                  <w:rPr>
+                    <w:rFonts w:ascii="Cambria Math" w:eastAsiaTheme="minorEastAsia" w:hAnsi="Cambria Math" w:cs="Times New Roman"/>
+                    <w:i/>
+                  </w:rPr>
+                </m:ctrlPr>
+              </m:sSubPr>
+              <m:e>
+                <m:r>
+                  <w:rPr>
+                    <w:rFonts w:ascii="Cambria Math" w:eastAsiaTheme="minorEastAsia" w:hAnsi="Cambria Math" w:cs="Times New Roman"/>
+                  </w:rPr>
+                  <m:t>G</m:t>
+                </m:r>
+              </m:e>
+              <m:sub>
+                <m:r>
+                  <w:rPr>
+                    <w:rFonts w:ascii="Cambria Math" w:eastAsiaTheme="minorEastAsia" w:hAnsi="Cambria Math" w:cs="Times New Roman"/>
+                  </w:rPr>
+                  <m:t>i</m:t>
+                </m:r>
+              </m:sub>
+            </m:sSub>
+          </m:sub>
+        </m:sSub>
+        <m:sSub>
+          <m:sSubPr>
+            <m:ctrlPr>
+              <w:rPr>
+                <w:rFonts w:ascii="Cambria Math" w:eastAsiaTheme="minorEastAsia" w:hAnsi="Cambria Math" w:cs="Times New Roman"/>
+                <w:i/>
+              </w:rPr>
+            </m:ctrlPr>
+          </m:sSubPr>
+          <m:e>
+            <m:r>
+              <w:rPr>
+                <w:rFonts w:ascii="Cambria Math" w:eastAsiaTheme="minorEastAsia" w:hAnsi="Cambria Math" w:cs="Times New Roman"/>
+              </w:rPr>
+              <m:t>C</m:t>
             </m:r>
           </m:e>
           <m:sub>
@@ -4837,112 +5633,10 @@
               <w:rPr>
                 <w:rFonts w:ascii="Cambria Math" w:eastAsiaTheme="minorEastAsia" w:hAnsi="Cambria Math" w:cs="Times New Roman"/>
               </w:rPr>
-              <m:t>S</m:t>
+              <m:t>i</m:t>
             </m:r>
           </m:sub>
         </m:sSub>
-        <m:r>
-          <w:rPr>
-            <w:rFonts w:ascii="Cambria Math" w:eastAsiaTheme="minorEastAsia" w:hAnsi="Cambria Math" w:cs="Times New Roman"/>
-          </w:rPr>
-          <m:t>+</m:t>
-        </m:r>
-        <m:sSub>
-          <m:sSubPr>
-            <m:ctrlPr>
-              <w:rPr>
-                <w:rFonts w:ascii="Cambria Math" w:eastAsiaTheme="minorEastAsia" w:hAnsi="Cambria Math" w:cs="Times New Roman"/>
-                <w:i/>
-              </w:rPr>
-            </m:ctrlPr>
-          </m:sSubPr>
-          <m:e>
-            <m:r>
-              <w:rPr>
-                <w:rFonts w:ascii="Cambria Math" w:eastAsiaTheme="minorEastAsia" w:hAnsi="Cambria Math" w:cs="Times New Roman"/>
-              </w:rPr>
-              <m:t>α</m:t>
-            </m:r>
-          </m:e>
-          <m:sub>
-            <m:r>
-              <w:rPr>
-                <w:rFonts w:ascii="Cambria Math" w:eastAsiaTheme="minorEastAsia" w:hAnsi="Cambria Math" w:cs="Times New Roman"/>
-              </w:rPr>
-              <m:t>E</m:t>
-            </m:r>
-          </m:sub>
-        </m:sSub>
-        <m:r>
-          <w:rPr>
-            <w:rFonts w:ascii="Cambria Math" w:eastAsiaTheme="minorEastAsia" w:hAnsi="Cambria Math" w:cs="Times New Roman"/>
-          </w:rPr>
-          <m:t>+</m:t>
-        </m:r>
-        <m:sSub>
-          <m:sSubPr>
-            <m:ctrlPr>
-              <w:rPr>
-                <w:rFonts w:ascii="Cambria Math" w:eastAsiaTheme="minorEastAsia" w:hAnsi="Cambria Math" w:cs="Times New Roman"/>
-                <w:i/>
-              </w:rPr>
-            </m:ctrlPr>
-          </m:sSubPr>
-          <m:e>
-            <m:r>
-              <w:rPr>
-                <w:rFonts w:ascii="Cambria Math" w:eastAsiaTheme="minorEastAsia" w:hAnsi="Cambria Math" w:cs="Times New Roman"/>
-              </w:rPr>
-              <m:t>β</m:t>
-            </m:r>
-          </m:e>
-          <m:sub>
-            <m:r>
-              <w:rPr>
-                <w:rFonts w:ascii="Cambria Math" w:eastAsiaTheme="minorEastAsia" w:hAnsi="Cambria Math" w:cs="Times New Roman"/>
-              </w:rPr>
-              <m:t>G</m:t>
-            </m:r>
-          </m:sub>
-        </m:sSub>
-        <m:r>
-          <w:rPr>
-            <w:rFonts w:ascii="Cambria Math" w:eastAsiaTheme="minorEastAsia" w:hAnsi="Cambria Math" w:cs="Times New Roman"/>
-          </w:rPr>
-          <m:t>×l+</m:t>
-        </m:r>
-        <m:sSub>
-          <m:sSubPr>
-            <m:ctrlPr>
-              <w:rPr>
-                <w:rFonts w:ascii="Cambria Math" w:eastAsiaTheme="minorEastAsia" w:hAnsi="Cambria Math" w:cs="Times New Roman"/>
-                <w:i/>
-              </w:rPr>
-            </m:ctrlPr>
-          </m:sSubPr>
-          <m:e>
-            <m:r>
-              <w:rPr>
-                <w:rFonts w:ascii="Cambria Math" w:eastAsiaTheme="minorEastAsia" w:hAnsi="Cambria Math" w:cs="Times New Roman"/>
-              </w:rPr>
-              <m:t>γ</m:t>
-            </m:r>
-          </m:e>
-          <m:sub>
-            <m:r>
-              <w:rPr>
-                <w:rFonts w:ascii="Cambria Math" w:eastAsiaTheme="minorEastAsia" w:hAnsi="Cambria Math" w:cs="Times New Roman"/>
-              </w:rPr>
-              <m:t>G</m:t>
-            </m:r>
-          </m:sub>
-        </m:sSub>
-        <m:r>
-          <w:rPr>
-            <w:rFonts w:ascii="Cambria Math" w:eastAsiaTheme="minorEastAsia" w:hAnsi="Cambria Math" w:cs="Times New Roman"/>
-          </w:rPr>
-          <m:t>×c</m:t>
-        </m:r>
       </m:oMath>
       <w:r>
         <w:rPr>
@@ -6583,7 +7277,7 @@
         <w:rPr>
           <w:rFonts w:ascii="Times New Roman" w:hAnsi="Times New Roman" w:cs="Times New Roman"/>
         </w:rPr>
-        <w:t>) indexed by plant group (</w:t>
+        <w:t xml:space="preserve">) indexed by </w:t>
       </w:r>
       <w:r>
         <w:rPr>
@@ -6597,7 +7291,7 @@
         <w:rPr>
           <w:rFonts w:ascii="Times New Roman" w:hAnsi="Times New Roman" w:cs="Times New Roman"/>
         </w:rPr>
-        <w:t>), species (</w:t>
+        <w:t xml:space="preserve">, </w:t>
       </w:r>
       <w:r>
         <w:rPr>
@@ -6611,7 +7305,7 @@
         <w:rPr>
           <w:rFonts w:ascii="Times New Roman" w:hAnsi="Times New Roman" w:cs="Times New Roman"/>
         </w:rPr>
-        <w:t>) and experiment (</w:t>
+        <w:t xml:space="preserve"> and </w:t>
       </w:r>
       <w:r>
         <w:rPr>
@@ -6625,7 +7319,31 @@
         <w:rPr>
           <w:rFonts w:ascii="Times New Roman" w:hAnsi="Times New Roman" w:cs="Times New Roman"/>
         </w:rPr>
-        <w:t>), the effect of light (</w:t>
+        <w:t xml:space="preserve"> </w:t>
+      </w:r>
+      <w:r>
+        <w:rPr>
+          <w:rFonts w:ascii="Times New Roman" w:hAnsi="Times New Roman" w:cs="Times New Roman"/>
+        </w:rPr>
+        <w:t xml:space="preserve">along with </w:t>
+      </w:r>
+      <w:r>
+        <w:rPr>
+          <w:rFonts w:ascii="Times New Roman" w:hAnsi="Times New Roman" w:cs="Times New Roman"/>
+        </w:rPr>
+        <w:t>the effect</w:t>
+      </w:r>
+      <w:r>
+        <w:rPr>
+          <w:rFonts w:ascii="Times New Roman" w:hAnsi="Times New Roman" w:cs="Times New Roman"/>
+        </w:rPr>
+        <w:t>s</w:t>
+      </w:r>
+      <w:r>
+        <w:rPr>
+          <w:rFonts w:ascii="Times New Roman" w:hAnsi="Times New Roman" w:cs="Times New Roman"/>
+        </w:rPr>
+        <w:t xml:space="preserve"> of light (</w:t>
       </w:r>
       <w:r>
         <w:rPr>
@@ -6639,7 +7357,19 @@
         <w:rPr>
           <w:rFonts w:ascii="Times New Roman" w:hAnsi="Times New Roman" w:cs="Times New Roman"/>
         </w:rPr>
-        <w:t>) and the effect of measuring chlorophyll relative to photosynthesis (</w:t>
+        <w:t xml:space="preserve">) and measuring chlorophyll </w:t>
+      </w:r>
+      <w:r>
+        <w:rPr>
+          <w:rFonts w:ascii="Times New Roman" w:hAnsi="Times New Roman" w:cs="Times New Roman"/>
+        </w:rPr>
+        <w:t>instead of</w:t>
+      </w:r>
+      <w:r>
+        <w:rPr>
+          <w:rFonts w:ascii="Times New Roman" w:hAnsi="Times New Roman" w:cs="Times New Roman"/>
+        </w:rPr>
+        <w:t xml:space="preserve"> photosynthesis (</w:t>
       </w:r>
       <w:r>
         <w:rPr>
@@ -6957,6 +7687,7 @@
         <w:rPr>
           <w:rFonts w:ascii="Times New Roman" w:hAnsi="Times New Roman" w:cs="Times New Roman"/>
         </w:rPr>
+        <w:lastRenderedPageBreak/>
         <w:t xml:space="preserve">The model was written in Stan </w:t>
       </w:r>
       <w:r>
@@ -7121,14 +7852,7 @@
         <w:rPr>
           <w:rFonts w:ascii="Times New Roman" w:hAnsi="Times New Roman" w:cs="Times New Roman"/>
         </w:rPr>
-        <w:t xml:space="preserve"> </w:t>
-      </w:r>
-      <w:r>
-        <w:rPr>
-          <w:rFonts w:ascii="Times New Roman" w:hAnsi="Times New Roman" w:cs="Times New Roman"/>
-        </w:rPr>
-        <w:lastRenderedPageBreak/>
-        <w:t xml:space="preserve">v3.0.7 </w:t>
+        <w:t xml:space="preserve"> v3.0.7 </w:t>
       </w:r>
       <w:r>
         <w:rPr>
@@ -8298,7 +9022,16 @@
           <w:i/>
           <w:iCs/>
         </w:rPr>
-        <w:t>H. ovalis</w:t>
+        <w:t xml:space="preserve">H. </w:t>
+      </w:r>
+      <w:r>
+        <w:rPr>
+          <w:rFonts w:ascii="Times New Roman" w:hAnsi="Times New Roman" w:cs="Times New Roman"/>
+          <w:i/>
+          <w:iCs/>
+        </w:rPr>
+        <w:lastRenderedPageBreak/>
+        <w:t>ovalis</w:t>
       </w:r>
       <w:r>
         <w:rPr>
@@ -8353,14 +9086,7 @@
         <w:rPr>
           <w:rFonts w:ascii="Times New Roman" w:hAnsi="Times New Roman" w:cs="Times New Roman"/>
         </w:rPr>
-        <w:t xml:space="preserve"> in Equation 1) was 3.9 ± 1.6 (mean ± standard deviation) times as </w:t>
-      </w:r>
-      <w:r>
-        <w:rPr>
-          <w:rFonts w:ascii="Times New Roman" w:hAnsi="Times New Roman" w:cs="Times New Roman"/>
-        </w:rPr>
-        <w:lastRenderedPageBreak/>
-        <w:t xml:space="preserve">long (Figure 1, Table 1). On a leaf basis, baseline </w:t>
+        <w:t xml:space="preserve"> in Equation 1) was 3.9 ± 1.6 (mean ± standard deviation) times as long (Figure 1, Table 1). On a leaf basis, baseline </w:t>
       </w:r>
       <w:r>
         <w:rPr>
@@ -8780,7 +9506,7 @@
         <w:rPr>
           <w:rFonts w:ascii="Times New Roman" w:hAnsi="Times New Roman" w:cs="Times New Roman"/>
         </w:rPr>
-        <w:t xml:space="preserve"> is standardised by leaf fresh mass. Violins are kernel density estimates of observations with measurement error (n = 42 for </w:t>
+        <w:t xml:space="preserve"> is standardised by leaf fresh mass. Violins are kernel density estimates of observations with measurement error (</w:t>
       </w:r>
       <w:r>
         <w:rPr>
@@ -8788,13 +9514,27 @@
           <w:i/>
           <w:iCs/>
         </w:rPr>
+        <w:t>n</w:t>
+      </w:r>
+      <w:r>
+        <w:rPr>
+          <w:rFonts w:ascii="Times New Roman" w:hAnsi="Times New Roman" w:cs="Times New Roman"/>
+        </w:rPr>
+        <w:t xml:space="preserve"> = 42 for </w:t>
+      </w:r>
+      <w:r>
+        <w:rPr>
+          <w:rFonts w:ascii="Times New Roman" w:hAnsi="Times New Roman" w:cs="Times New Roman"/>
+          <w:i/>
+          <w:iCs/>
+        </w:rPr>
         <w:t>H. ovalis</w:t>
       </w:r>
       <w:r>
         <w:rPr>
           <w:rFonts w:ascii="Times New Roman" w:hAnsi="Times New Roman" w:cs="Times New Roman"/>
         </w:rPr>
-        <w:t xml:space="preserve">, n = 39 for </w:t>
+        <w:t xml:space="preserve">, </w:t>
       </w:r>
       <w:r>
         <w:rPr>
@@ -8802,13 +9542,27 @@
           <w:i/>
           <w:iCs/>
         </w:rPr>
+        <w:t>n</w:t>
+      </w:r>
+      <w:r>
+        <w:rPr>
+          <w:rFonts w:ascii="Times New Roman" w:hAnsi="Times New Roman" w:cs="Times New Roman"/>
+        </w:rPr>
+        <w:t xml:space="preserve"> = 39 for </w:t>
+      </w:r>
+      <w:r>
+        <w:rPr>
+          <w:rFonts w:ascii="Times New Roman" w:hAnsi="Times New Roman" w:cs="Times New Roman"/>
+          <w:i/>
+          <w:iCs/>
+        </w:rPr>
         <w:t>A. antarctica</w:t>
       </w:r>
       <w:r>
         <w:rPr>
           <w:rFonts w:ascii="Times New Roman" w:hAnsi="Times New Roman" w:cs="Times New Roman"/>
         </w:rPr>
-        <w:t xml:space="preserve">). Lines and intervals are medians and the central 50%, 80% and 90% of posterior probability for predicted observations. Distributions are posteriors for initial </w:t>
+        <w:t xml:space="preserve">). Lines and intervals are medians and the central 50, 80 and 90% of posterior probability for predicted observations. Distributions are posteriors for initial </w:t>
       </w:r>
       <w:r>
         <w:rPr>
@@ -8911,7 +9665,6 @@
           <w:b/>
           <w:bCs/>
         </w:rPr>
-        <w:lastRenderedPageBreak/>
         <w:t>Table 1</w:t>
       </w:r>
       <w:r>
@@ -10214,29 +10967,35 @@
         <w:rPr>
           <w:rFonts w:ascii="Times New Roman" w:hAnsi="Times New Roman" w:cs="Times New Roman"/>
         </w:rPr>
-        <w:t>The choice of response variable also matters when estimating detrital photosynthesis. Chlorophyll generally decays slower than photosynthesis. This pattern is consistent across all plants with photosynthetic half-life predicted to be 1.4 times (ln ratio = 0.33 ± 0.36) as long for chlorophyll as for photosynthesis (Figure 2, Table 2). In absolute terms, the effect again naturally dominates for seaweeds (Figure 2), with an increase from 51 days for photosynthesis to 81 days for chlorophyll under light (Table S2). Measurements based on chlorophyll therefore tend to overestimate the longevity of detrital photosynthesis, especially for seaweeds.</w:t>
-      </w:r>
-    </w:p>
-    <w:p>
-      <w:pPr>
-        <w:spacing w:line="360" w:lineRule="auto"/>
-        <w:rPr>
-          <w:rFonts w:ascii="Times New Roman" w:hAnsi="Times New Roman" w:cs="Times New Roman"/>
-        </w:rPr>
-      </w:pPr>
-    </w:p>
-    <w:p>
-      <w:pPr>
-        <w:spacing w:line="360" w:lineRule="auto"/>
-        <w:rPr>
-          <w:rFonts w:ascii="Times New Roman" w:hAnsi="Times New Roman" w:cs="Times New Roman"/>
-        </w:rPr>
-      </w:pPr>
+        <w:t xml:space="preserve">The choice of response variable also matters when estimating detrital photosynthesis. Chlorophyll generally decays slower than photosynthesis. This pattern is consistent across all plants with photosynthetic half-life predicted to be 1.4 times (ln ratio = 0.33 ± 0.36) as long for chlorophyll as for photosynthesis (Figure 2, Table 2). In absolute terms, the effect again naturally dominates for seaweeds (Figure 2), with an increase from 51 days for photosynthesis to 81 days </w:t>
+      </w:r>
       <w:r>
         <w:rPr>
           <w:rFonts w:ascii="Times New Roman" w:hAnsi="Times New Roman" w:cs="Times New Roman"/>
         </w:rPr>
         <w:lastRenderedPageBreak/>
+        <w:t>for chlorophyll under light (Table S2). Measurements based on chlorophyll therefore tend to overestimate the longevity of detrital photosynthesis, especially for seaweeds.</w:t>
+      </w:r>
+    </w:p>
+    <w:p>
+      <w:pPr>
+        <w:spacing w:line="360" w:lineRule="auto"/>
+        <w:rPr>
+          <w:rFonts w:ascii="Times New Roman" w:hAnsi="Times New Roman" w:cs="Times New Roman"/>
+        </w:rPr>
+      </w:pPr>
+    </w:p>
+    <w:p>
+      <w:pPr>
+        <w:spacing w:line="360" w:lineRule="auto"/>
+        <w:rPr>
+          <w:rFonts w:ascii="Times New Roman" w:hAnsi="Times New Roman" w:cs="Times New Roman"/>
+        </w:rPr>
+      </w:pPr>
+      <w:r>
+        <w:rPr>
+          <w:rFonts w:ascii="Times New Roman" w:hAnsi="Times New Roman" w:cs="Times New Roman"/>
+        </w:rPr>
         <w:t>Across light conditions and response variables, the median half-life of detrital photosynthesis ranges from 11 days for terrestrial plants, over 14 and 17 days for freshwater plants and seagrasses to 44 days for seaweeds (Table 2). The prediction for new plants is 17 days (ln days = 2.8 ± 1.1). In relative terms, seaweed detrital photosynthesis persists 3.9, 3.1, and 2.5 times as long as that of terrestrial plants, freshwater plants and seagrasses (Table 3, Figure S2). All vascular plant detritus remains viable for similar durations but there is a tendency for that of freshwater plants to have a somewhat longer photosynthetic half-life compared to terrestrial plants, with that of seagrasses being longer still (Table 3, Figure S2). This suggests that the non-vascular macroalgae have the greatest potential for detrital photosynthesis while among the vascular plants there is increased detrital viability with a shift from a terrestrial to an aquatic and yet again to a marine lifestyle.</w:t>
       </w:r>
     </w:p>
@@ -11603,7 +12362,14 @@
         <w:rPr>
           <w:rFonts w:ascii="Times New Roman" w:hAnsi="Times New Roman" w:cs="Times New Roman"/>
         </w:rPr>
-        <w:t xml:space="preserve">Notwithstanding these general trends, there is substantial interspecific and experimental variation in photosynthetic half-life (Figure 3). Median estimates for species range from 3–4 days for the wheat </w:t>
+        <w:t xml:space="preserve">Notwithstanding these general trends, there is substantial interspecific and experimental variation in photosynthetic half-life (Figure 3). Median estimates for species range from 3–4 days for the </w:t>
+      </w:r>
+      <w:r>
+        <w:rPr>
+          <w:rFonts w:ascii="Times New Roman" w:hAnsi="Times New Roman" w:cs="Times New Roman"/>
+        </w:rPr>
+        <w:lastRenderedPageBreak/>
+        <w:t xml:space="preserve">wheat </w:t>
       </w:r>
       <w:r>
         <w:rPr>
@@ -11632,14 +12398,7 @@
         <w:rPr>
           <w:rFonts w:ascii="Times New Roman" w:hAnsi="Times New Roman" w:cs="Times New Roman"/>
         </w:rPr>
-        <w:t xml:space="preserve"> (Table S3). Median estimates for experiments range from 1.2 to 438 days. The variance in photosynthetic half-life between plant groups, species and experiments is directly quantified by </w:t>
-      </w:r>
-      <w:r>
-        <w:rPr>
-          <w:rFonts w:ascii="Times New Roman" w:hAnsi="Times New Roman" w:cs="Times New Roman"/>
-        </w:rPr>
-        <w:lastRenderedPageBreak/>
-        <w:t>logarithmic partial pooling standard deviations (</w:t>
+        <w:t xml:space="preserve"> (Table S3). Median estimates for experiments range from 1.2 to 438 days. The variance in photosynthetic half-life between plant groups, species and experiments is directly quantified by logarithmic partial pooling standard deviations (</w:t>
       </w:r>
       <w:r>
         <w:rPr>
@@ -11826,7 +12585,14 @@
         <w:rPr>
           <w:rFonts w:ascii="Times New Roman" w:hAnsi="Times New Roman" w:cs="Times New Roman"/>
         </w:rPr>
-        <w:t xml:space="preserve"> ranges. Lines and intervals are medians and the central 50%, 80% and 90% of posterior probability for the median prediction (</w:t>
+        <w:t xml:space="preserve"> ranges. Lines and intervals are medians and the central 50, 80 and 90% of </w:t>
+      </w:r>
+      <w:r>
+        <w:rPr>
+          <w:rFonts w:ascii="Times New Roman" w:hAnsi="Times New Roman" w:cs="Times New Roman"/>
+        </w:rPr>
+        <w:lastRenderedPageBreak/>
+        <w:t>posterior probability for the median prediction (</w:t>
       </w:r>
       <m:oMath>
         <m:sSup>
@@ -12120,6 +12886,12 @@
         </w:rPr>
         <w:t xml:space="preserve"> are given as median (ln mean ± standard deviation).</w:t>
       </w:r>
+      <w:r>
+        <w:rPr>
+          <w:rFonts w:ascii="Times New Roman" w:hAnsi="Times New Roman" w:cs="Times New Roman"/>
+        </w:rPr>
+        <w:t xml:space="preserve"> See Table 2 for sample sizes.</w:t>
+      </w:r>
     </w:p>
     <w:tbl>
       <w:tblPr>
@@ -12134,9 +12906,6 @@
         <w:gridCol w:w="1430"/>
       </w:tblGrid>
       <w:tr>
-        <w:trPr>
-          <w:tblHeader/>
-        </w:trPr>
         <w:tc>
           <w:tcPr>
             <w:tcW w:w="1432" w:type="pct"/>
@@ -12159,6 +12928,7 @@
                 <w:b/>
                 <w:bCs/>
               </w:rPr>
+              <w:lastRenderedPageBreak/>
               <w:t>Ratio</w:t>
             </w:r>
           </w:p>
@@ -12941,7 +13711,6 @@
               <w:rPr>
                 <w:rFonts w:ascii="Times New Roman" w:hAnsi="Times New Roman" w:cs="Times New Roman"/>
               </w:rPr>
-              <w:lastRenderedPageBreak/>
               <w:t>Seagrasses / Freshwater</w:t>
             </w:r>
           </w:p>
@@ -13207,7 +13976,14 @@
         <w:rPr>
           <w:rFonts w:ascii="Times New Roman" w:hAnsi="Times New Roman" w:cs="Times New Roman"/>
         </w:rPr>
-        <w:t xml:space="preserve"> = 314, 32, 8 and 197 for terrestrial plants, freshwater plants, seagrasses and seaweeds) are given in colour and predictions for new experiments on unobserved species across the light and chlorophyll effects are given in black. Raincloud plots of detrital half-life (</w:t>
+        <w:t xml:space="preserve"> = 314, 32, 8 and 197 for terrestrial plants, freshwater plants, seagrasses and seaweeds) are given in colour and predictions for new experiments on unobserved species across the light and chlorophyll effects are given in </w:t>
+      </w:r>
+      <w:r>
+        <w:rPr>
+          <w:rFonts w:ascii="Times New Roman" w:hAnsi="Times New Roman" w:cs="Times New Roman"/>
+        </w:rPr>
+        <w:lastRenderedPageBreak/>
+        <w:t>black. Raincloud plots of detrital half-life (</w:t>
       </w:r>
       <w:r>
         <w:rPr>
@@ -13278,14 +14054,7 @@
         <w:rPr>
           <w:rFonts w:ascii="Times New Roman" w:hAnsi="Times New Roman" w:cs="Times New Roman"/>
         </w:rPr>
-        <w:t xml:space="preserve"> = 239, 33, 32 and 171 for terrestrial plants, freshwater plants, seagrasses and seaweeds) below posterior probability distributions for new observations. Distributions in the bottom panel are ratios of the </w:t>
-      </w:r>
-      <w:r>
-        <w:rPr>
-          <w:rFonts w:ascii="Times New Roman" w:hAnsi="Times New Roman" w:cs="Times New Roman"/>
-        </w:rPr>
-        <w:lastRenderedPageBreak/>
-        <w:t xml:space="preserve">black distributions of </w:t>
+        <w:t xml:space="preserve"> = 239, 33, 32 and 171 for terrestrial plants, freshwater plants, seagrasses and seaweeds) below posterior probability distributions for new observations. Distributions in the bottom panel are ratios of the black distributions of </w:t>
       </w:r>
       <w:r>
         <w:rPr>
@@ -13616,6 +14385,7 @@
         <w:rPr>
           <w:rFonts w:ascii="Times New Roman" w:hAnsi="Times New Roman" w:cs="Times New Roman"/>
         </w:rPr>
+        <w:lastRenderedPageBreak/>
         <w:fldChar w:fldCharType="begin"/>
       </w:r>
       <w:r>
@@ -13752,14 +14522,518 @@
         <w:rPr>
           <w:rFonts w:ascii="Times New Roman" w:hAnsi="Times New Roman" w:cs="Times New Roman"/>
         </w:rPr>
+        <w:t xml:space="preserve"> can continue growing to a similar or greater extent relative to other seagrasses </w:t>
+      </w:r>
+      <w:r>
+        <w:rPr>
+          <w:rFonts w:ascii="Times New Roman" w:hAnsi="Times New Roman" w:cs="Times New Roman"/>
+        </w:rPr>
+        <w:fldChar w:fldCharType="begin"/>
+      </w:r>
+      <w:r>
+        <w:rPr>
+          <w:rFonts w:ascii="Times New Roman" w:hAnsi="Times New Roman" w:cs="Times New Roman"/>
+        </w:rPr>
+        <w:instrText>ADDIN BEC{Hanuise et al., 2026 #276454}</w:instrText>
+      </w:r>
+      <w:r>
+        <w:rPr>
+          <w:rFonts w:ascii="Times New Roman" w:hAnsi="Times New Roman" w:cs="Times New Roman"/>
+        </w:rPr>
+        <w:fldChar w:fldCharType="separate"/>
+      </w:r>
+      <w:r>
+        <w:rPr>
+          <w:rFonts w:ascii="Times New Roman" w:hAnsi="Times New Roman" w:cs="Times New Roman"/>
+        </w:rPr>
+        <w:t>(Hanuise et al. 2026)</w:t>
+      </w:r>
+      <w:r>
+        <w:rPr>
+          <w:rFonts w:ascii="Times New Roman" w:hAnsi="Times New Roman" w:cs="Times New Roman"/>
+        </w:rPr>
+        <w:fldChar w:fldCharType="end"/>
+      </w:r>
+      <w:r>
+        <w:rPr>
+          <w:rFonts w:ascii="Times New Roman" w:hAnsi="Times New Roman" w:cs="Times New Roman"/>
+        </w:rPr>
+        <w:t xml:space="preserve">. Despite such observations of apparent detrital growth for up to a month </w:t>
+      </w:r>
+      <w:r>
+        <w:rPr>
+          <w:rFonts w:ascii="Times New Roman" w:hAnsi="Times New Roman" w:cs="Times New Roman"/>
+        </w:rPr>
+        <w:fldChar w:fldCharType="begin"/>
+      </w:r>
+      <w:r>
+        <w:rPr>
+          <w:rFonts w:ascii="Times New Roman" w:hAnsi="Times New Roman" w:cs="Times New Roman"/>
+        </w:rPr>
+        <w:instrText>ADDIN BEC{Hanuise et al., 2026 #276454}</w:instrText>
+      </w:r>
+      <w:r>
+        <w:rPr>
+          <w:rFonts w:ascii="Times New Roman" w:hAnsi="Times New Roman" w:cs="Times New Roman"/>
+        </w:rPr>
+        <w:fldChar w:fldCharType="separate"/>
+      </w:r>
+      <w:r>
+        <w:rPr>
+          <w:rFonts w:ascii="Times New Roman" w:hAnsi="Times New Roman" w:cs="Times New Roman"/>
+        </w:rPr>
+        <w:t>(Hanuise et al. 2026)</w:t>
+      </w:r>
+      <w:r>
+        <w:rPr>
+          <w:rFonts w:ascii="Times New Roman" w:hAnsi="Times New Roman" w:cs="Times New Roman"/>
+        </w:rPr>
+        <w:fldChar w:fldCharType="end"/>
+      </w:r>
+      <w:r>
+        <w:rPr>
+          <w:rFonts w:ascii="Times New Roman" w:hAnsi="Times New Roman" w:cs="Times New Roman"/>
+        </w:rPr>
+        <w:t xml:space="preserve"> and my evidence of photosynthetic persistence for a similar duration, seagrass detrital photosynthesis may not necessarily counteract decomposition. Seagrass detritus has a half-life of 68 days on average and complete decomposition may take a year </w:t>
+      </w:r>
+      <w:r>
+        <w:rPr>
+          <w:rFonts w:ascii="Times New Roman" w:hAnsi="Times New Roman" w:cs="Times New Roman"/>
+        </w:rPr>
+        <w:fldChar w:fldCharType="begin"/>
+      </w:r>
+      <w:r>
+        <w:rPr>
+          <w:rFonts w:ascii="Times New Roman" w:hAnsi="Times New Roman" w:cs="Times New Roman"/>
+        </w:rPr>
+        <w:instrText>ADDIN BEC{Harrison, 1989 #14810; Cebrián et al., 1997 #2780; Cebrián and Lartigue, 2004 #25396; Trevathan-Tackett et al., 2020 #39238}</w:instrText>
+      </w:r>
+      <w:r>
+        <w:rPr>
+          <w:rFonts w:ascii="Times New Roman" w:hAnsi="Times New Roman" w:cs="Times New Roman"/>
+        </w:rPr>
+        <w:fldChar w:fldCharType="separate"/>
+      </w:r>
+      <w:r>
+        <w:rPr>
+          <w:rFonts w:ascii="Times New Roman" w:hAnsi="Times New Roman" w:cs="Times New Roman"/>
+        </w:rPr>
+        <w:t>(Harrison 1989, Cebrián et al. 1997, Cebrián &amp; Lartigue 2004, Trevathan-Tackett et al. 2020)</w:t>
+      </w:r>
+      <w:r>
+        <w:rPr>
+          <w:rFonts w:ascii="Times New Roman" w:hAnsi="Times New Roman" w:cs="Times New Roman"/>
+        </w:rPr>
+        <w:fldChar w:fldCharType="end"/>
+      </w:r>
+      <w:r>
+        <w:rPr>
+          <w:rFonts w:ascii="Times New Roman" w:hAnsi="Times New Roman" w:cs="Times New Roman"/>
+        </w:rPr>
+        <w:t xml:space="preserve">. While live </w:t>
+      </w:r>
+      <w:r>
+        <w:rPr>
+          <w:rFonts w:ascii="Times New Roman" w:hAnsi="Times New Roman" w:cs="Times New Roman"/>
+          <w:i/>
+          <w:iCs/>
+        </w:rPr>
+        <w:t xml:space="preserve">Halophila </w:t>
+      </w:r>
+      <w:proofErr w:type="spellStart"/>
+      <w:r>
+        <w:rPr>
+          <w:rFonts w:ascii="Times New Roman" w:hAnsi="Times New Roman" w:cs="Times New Roman"/>
+          <w:i/>
+          <w:iCs/>
+        </w:rPr>
+        <w:t>decipiens</w:t>
+      </w:r>
+      <w:proofErr w:type="spellEnd"/>
+      <w:r>
+        <w:rPr>
+          <w:rFonts w:ascii="Times New Roman" w:hAnsi="Times New Roman" w:cs="Times New Roman"/>
+        </w:rPr>
+        <w:t xml:space="preserve"> ramets do indeed decompose slower than buried ones </w:t>
+      </w:r>
+      <w:r>
+        <w:rPr>
+          <w:rFonts w:ascii="Times New Roman" w:hAnsi="Times New Roman" w:cs="Times New Roman"/>
+        </w:rPr>
+        <w:fldChar w:fldCharType="begin"/>
+      </w:r>
+      <w:r>
+        <w:rPr>
+          <w:rFonts w:ascii="Times New Roman" w:hAnsi="Times New Roman" w:cs="Times New Roman"/>
+        </w:rPr>
+        <w:instrText>ADDIN BEC{Kenworthy et al., 1989 #80759}</w:instrText>
+      </w:r>
+      <w:r>
+        <w:rPr>
+          <w:rFonts w:ascii="Times New Roman" w:hAnsi="Times New Roman" w:cs="Times New Roman"/>
+        </w:rPr>
+        <w:fldChar w:fldCharType="separate"/>
+      </w:r>
+      <w:r>
+        <w:rPr>
+          <w:rFonts w:ascii="Times New Roman" w:hAnsi="Times New Roman" w:cs="Times New Roman"/>
+        </w:rPr>
+        <w:t>(Kenworthy et al. 1989)</w:t>
+      </w:r>
+      <w:r>
+        <w:rPr>
+          <w:rFonts w:ascii="Times New Roman" w:hAnsi="Times New Roman" w:cs="Times New Roman"/>
+        </w:rPr>
+        <w:fldChar w:fldCharType="end"/>
+      </w:r>
+      <w:r>
+        <w:rPr>
+          <w:rFonts w:ascii="Times New Roman" w:hAnsi="Times New Roman" w:cs="Times New Roman"/>
+        </w:rPr>
+        <w:t xml:space="preserve">, decomposition rates are similar between live and senescent or buried </w:t>
+      </w:r>
+      <w:proofErr w:type="spellStart"/>
+      <w:r>
+        <w:rPr>
+          <w:rFonts w:ascii="Times New Roman" w:hAnsi="Times New Roman" w:cs="Times New Roman"/>
+          <w:i/>
+          <w:iCs/>
+        </w:rPr>
+        <w:t>Thalassia</w:t>
+      </w:r>
+      <w:proofErr w:type="spellEnd"/>
+      <w:r>
+        <w:rPr>
+          <w:rFonts w:ascii="Times New Roman" w:hAnsi="Times New Roman" w:cs="Times New Roman"/>
+          <w:i/>
+          <w:iCs/>
+        </w:rPr>
         <w:t xml:space="preserve"> </w:t>
       </w:r>
+      <w:proofErr w:type="spellStart"/>
+      <w:r>
+        <w:rPr>
+          <w:rFonts w:ascii="Times New Roman" w:hAnsi="Times New Roman" w:cs="Times New Roman"/>
+          <w:i/>
+          <w:iCs/>
+        </w:rPr>
+        <w:t>testudinum</w:t>
+      </w:r>
+      <w:proofErr w:type="spellEnd"/>
+      <w:r>
+        <w:rPr>
+          <w:rFonts w:ascii="Times New Roman" w:hAnsi="Times New Roman" w:cs="Times New Roman"/>
+        </w:rPr>
+        <w:t xml:space="preserve"> leaves </w:t>
+      </w:r>
+      <w:r>
+        <w:rPr>
+          <w:rFonts w:ascii="Times New Roman" w:hAnsi="Times New Roman" w:cs="Times New Roman"/>
+        </w:rPr>
+        <w:fldChar w:fldCharType="begin"/>
+      </w:r>
+      <w:r>
+        <w:rPr>
+          <w:rFonts w:ascii="Times New Roman" w:hAnsi="Times New Roman" w:cs="Times New Roman"/>
+        </w:rPr>
+        <w:instrText>ADDIN BEC{Rublee and Roman, 1982 #60679; Fourqurean and Schrlau, 2003 #17180; Rosch and Koch, 2009 #45001}</w:instrText>
+      </w:r>
+      <w:r>
+        <w:rPr>
+          <w:rFonts w:ascii="Times New Roman" w:hAnsi="Times New Roman" w:cs="Times New Roman"/>
+        </w:rPr>
+        <w:fldChar w:fldCharType="separate"/>
+      </w:r>
+      <w:r>
+        <w:rPr>
+          <w:rFonts w:ascii="Times New Roman" w:hAnsi="Times New Roman" w:cs="Times New Roman"/>
+        </w:rPr>
+        <w:t>(Rublee &amp; Roman 1982, Fourqurean &amp; Schrlau 2003, Rosch &amp; Koch 2009)</w:t>
+      </w:r>
+      <w:r>
+        <w:rPr>
+          <w:rFonts w:ascii="Times New Roman" w:hAnsi="Times New Roman" w:cs="Times New Roman"/>
+        </w:rPr>
+        <w:fldChar w:fldCharType="end"/>
+      </w:r>
+      <w:r>
+        <w:rPr>
+          <w:rFonts w:ascii="Times New Roman" w:hAnsi="Times New Roman" w:cs="Times New Roman"/>
+        </w:rPr>
+        <w:t xml:space="preserve"> and reviews suggest that live seagrass leaves actually tend to decompose faster than senescent or dead ones </w:t>
+      </w:r>
+      <w:r>
+        <w:rPr>
+          <w:rFonts w:ascii="Times New Roman" w:hAnsi="Times New Roman" w:cs="Times New Roman"/>
+        </w:rPr>
+        <w:fldChar w:fldCharType="begin"/>
+      </w:r>
+      <w:r>
+        <w:rPr>
+          <w:rFonts w:ascii="Times New Roman" w:hAnsi="Times New Roman" w:cs="Times New Roman"/>
+        </w:rPr>
+        <w:instrText>ADDIN BEC{Harrison, 1989 #14810; Trevathan-Tackett et al., 2020 #39238}</w:instrText>
+      </w:r>
+      <w:r>
+        <w:rPr>
+          <w:rFonts w:ascii="Times New Roman" w:hAnsi="Times New Roman" w:cs="Times New Roman"/>
+        </w:rPr>
+        <w:fldChar w:fldCharType="separate"/>
+      </w:r>
+      <w:r>
+        <w:rPr>
+          <w:rFonts w:ascii="Times New Roman" w:hAnsi="Times New Roman" w:cs="Times New Roman"/>
+        </w:rPr>
+        <w:t>(Harrison 1989, Trevathan-Tackett et al. 2020)</w:t>
+      </w:r>
+      <w:r>
+        <w:rPr>
+          <w:rFonts w:ascii="Times New Roman" w:hAnsi="Times New Roman" w:cs="Times New Roman"/>
+        </w:rPr>
+        <w:fldChar w:fldCharType="end"/>
+      </w:r>
+      <w:r>
+        <w:rPr>
+          <w:rFonts w:ascii="Times New Roman" w:hAnsi="Times New Roman" w:cs="Times New Roman"/>
+        </w:rPr>
+        <w:t>.</w:t>
+      </w:r>
+    </w:p>
+    <w:p>
+      <w:pPr>
+        <w:spacing w:line="360" w:lineRule="auto"/>
+        <w:rPr>
+          <w:rFonts w:ascii="Times New Roman" w:hAnsi="Times New Roman" w:cs="Times New Roman"/>
+        </w:rPr>
+      </w:pPr>
+    </w:p>
+    <w:p>
+      <w:pPr>
+        <w:spacing w:line="360" w:lineRule="auto"/>
+        <w:rPr>
+          <w:rFonts w:ascii="Times New Roman" w:hAnsi="Times New Roman" w:cs="Times New Roman"/>
+        </w:rPr>
+      </w:pPr>
+      <w:r>
+        <w:rPr>
+          <w:rFonts w:ascii="Times New Roman" w:hAnsi="Times New Roman" w:cs="Times New Roman"/>
+        </w:rPr>
+        <w:t xml:space="preserve">Macroalgae uniquely exhibit long-term detrital photosynthesis, with extreme cases persisting up to a year. As expected from their aquatic lifestyle, seagrasses and freshwater plants exhibit intermediate detrital longevity between seaweeds and terrestrial plants, whose leaves photosynthesise for less than two weeks following excision. The extreme contrast to terrestrial plants has been demonstrated but is in fact somewhat dampened by my formal analysis. With access to light but not water, which is the normal fate of terrestrial plant detritus, detached leaves of various trees tend to lose the ability to photosynthesise in just a few minutes (e.g. </w:t>
+      </w:r>
+      <w:r>
+        <w:rPr>
+          <w:rFonts w:ascii="Times New Roman" w:hAnsi="Times New Roman" w:cs="Times New Roman"/>
+        </w:rPr>
+        <w:fldChar w:fldCharType="begin"/>
+      </w:r>
+      <w:r>
+        <w:rPr>
+          <w:rFonts w:ascii="Times New Roman" w:hAnsi="Times New Roman" w:cs="Times New Roman"/>
+        </w:rPr>
+        <w:instrText>ADDIN BEC{Gauthier and Jacobs, 2018 #82785; Kar et al., 2021 #107105}</w:instrText>
+      </w:r>
+      <w:r>
+        <w:rPr>
+          <w:rFonts w:ascii="Times New Roman" w:hAnsi="Times New Roman" w:cs="Times New Roman"/>
+        </w:rPr>
+        <w:fldChar w:fldCharType="separate"/>
+      </w:r>
+      <w:r>
+        <w:rPr>
+          <w:rFonts w:ascii="Times New Roman" w:hAnsi="Times New Roman" w:cs="Times New Roman"/>
+        </w:rPr>
+        <w:t>Gauthier &amp; Jacobs 2018, Kar et al. 2021)</w:t>
+      </w:r>
+      <w:r>
+        <w:rPr>
+          <w:rFonts w:ascii="Times New Roman" w:hAnsi="Times New Roman" w:cs="Times New Roman"/>
+        </w:rPr>
+        <w:fldChar w:fldCharType="end"/>
+      </w:r>
+      <w:r>
+        <w:rPr>
+          <w:rFonts w:ascii="Times New Roman" w:hAnsi="Times New Roman" w:cs="Times New Roman"/>
+        </w:rPr>
+        <w:t xml:space="preserve"> due to breakdown of stomatal conductance following a loss in water pressure </w:t>
+      </w:r>
+      <w:r>
+        <w:rPr>
+          <w:rFonts w:ascii="Times New Roman" w:hAnsi="Times New Roman" w:cs="Times New Roman"/>
+        </w:rPr>
+        <w:fldChar w:fldCharType="begin"/>
+      </w:r>
+      <w:r>
+        <w:rPr>
+          <w:rFonts w:ascii="Times New Roman" w:hAnsi="Times New Roman" w:cs="Times New Roman"/>
+        </w:rPr>
+        <w:instrText>ADDIN BEC{Powles et al., 2006 #74407; Gauthier and Jacobs, 2018 #82785}</w:instrText>
+      </w:r>
+      <w:r>
+        <w:rPr>
+          <w:rFonts w:ascii="Times New Roman" w:hAnsi="Times New Roman" w:cs="Times New Roman"/>
+        </w:rPr>
+        <w:fldChar w:fldCharType="separate"/>
+      </w:r>
+      <w:r>
+        <w:rPr>
+          <w:rFonts w:ascii="Times New Roman" w:hAnsi="Times New Roman" w:cs="Times New Roman"/>
+        </w:rPr>
+        <w:t>(Powles et al. 2006, Gauthier &amp; Jacobs 2018)</w:t>
+      </w:r>
+      <w:r>
+        <w:rPr>
+          <w:rFonts w:ascii="Times New Roman" w:hAnsi="Times New Roman" w:cs="Times New Roman"/>
+        </w:rPr>
+        <w:fldChar w:fldCharType="end"/>
+      </w:r>
+      <w:r>
+        <w:rPr>
+          <w:rFonts w:ascii="Times New Roman" w:hAnsi="Times New Roman" w:cs="Times New Roman"/>
+        </w:rPr>
+        <w:t xml:space="preserve">. Surprisingly seagrasses detritus tends to photosynthesise for longer than that of freshwater </w:t>
+      </w:r>
+      <w:proofErr w:type="spellStart"/>
+      <w:r>
+        <w:rPr>
+          <w:rFonts w:ascii="Times New Roman" w:hAnsi="Times New Roman" w:cs="Times New Roman"/>
+        </w:rPr>
+        <w:t>Alismatales</w:t>
+      </w:r>
+      <w:proofErr w:type="spellEnd"/>
+      <w:r>
+        <w:rPr>
+          <w:rFonts w:ascii="Times New Roman" w:hAnsi="Times New Roman" w:cs="Times New Roman"/>
+        </w:rPr>
+        <w:t xml:space="preserve">. The adoption of a marine lifestyle and convergent evolution with seaweeds </w:t>
+      </w:r>
+      <w:r>
+        <w:rPr>
+          <w:rFonts w:ascii="Times New Roman" w:hAnsi="Times New Roman" w:cs="Times New Roman"/>
+        </w:rPr>
+        <w:fldChar w:fldCharType="begin"/>
+      </w:r>
+      <w:r>
+        <w:rPr>
+          <w:rFonts w:ascii="Times New Roman" w:hAnsi="Times New Roman" w:cs="Times New Roman"/>
+        </w:rPr>
+        <w:instrText>ADDIN BEC{Olsen et al., 2016 #67412}</w:instrText>
+      </w:r>
+      <w:r>
+        <w:rPr>
+          <w:rFonts w:ascii="Times New Roman" w:hAnsi="Times New Roman" w:cs="Times New Roman"/>
+        </w:rPr>
+        <w:fldChar w:fldCharType="separate"/>
+      </w:r>
+      <w:r>
+        <w:rPr>
+          <w:rFonts w:ascii="Times New Roman" w:hAnsi="Times New Roman" w:cs="Times New Roman"/>
+        </w:rPr>
+        <w:t>(Olsen et al. 2016)</w:t>
+      </w:r>
+      <w:r>
+        <w:rPr>
+          <w:rFonts w:ascii="Times New Roman" w:hAnsi="Times New Roman" w:cs="Times New Roman"/>
+        </w:rPr>
+        <w:fldChar w:fldCharType="end"/>
+      </w:r>
+      <w:r>
+        <w:rPr>
+          <w:rFonts w:ascii="Times New Roman" w:hAnsi="Times New Roman" w:cs="Times New Roman"/>
+        </w:rPr>
+        <w:t xml:space="preserve"> may be the ultimate reason. But a more proximate explanation is excess production of hydrogen peroxide in detached freshwater plant leaves </w:t>
+      </w:r>
+      <w:r>
+        <w:rPr>
+          <w:rFonts w:ascii="Times New Roman" w:hAnsi="Times New Roman" w:cs="Times New Roman"/>
+        </w:rPr>
+        <w:fldChar w:fldCharType="begin"/>
+      </w:r>
+      <w:r>
+        <w:rPr>
+          <w:rFonts w:ascii="Times New Roman" w:hAnsi="Times New Roman" w:cs="Times New Roman"/>
+        </w:rPr>
+        <w:instrText>ADDIN BEC{Jana and Choudhuri, 1982 #17463; Kar and Choudhuri, 1986 #86993; Kar and Choudhuri, 1987 #71732}</w:instrText>
+      </w:r>
+      <w:r>
+        <w:rPr>
+          <w:rFonts w:ascii="Times New Roman" w:hAnsi="Times New Roman" w:cs="Times New Roman"/>
+        </w:rPr>
+        <w:fldChar w:fldCharType="separate"/>
+      </w:r>
+      <w:r>
+        <w:rPr>
+          <w:rFonts w:ascii="Times New Roman" w:hAnsi="Times New Roman" w:cs="Times New Roman"/>
+        </w:rPr>
+        <w:t>(Jana &amp; Choudhuri 1982, Kar &amp; Choudhuri 1986, 1987)</w:t>
+      </w:r>
+      <w:r>
+        <w:rPr>
+          <w:rFonts w:ascii="Times New Roman" w:hAnsi="Times New Roman" w:cs="Times New Roman"/>
+        </w:rPr>
+        <w:fldChar w:fldCharType="end"/>
+      </w:r>
+      <w:r>
+        <w:rPr>
+          <w:rFonts w:ascii="Times New Roman" w:hAnsi="Times New Roman" w:cs="Times New Roman"/>
+        </w:rPr>
+        <w:t xml:space="preserve">. As demonstrated for </w:t>
+      </w:r>
+      <w:r>
+        <w:rPr>
+          <w:rFonts w:ascii="Times New Roman" w:hAnsi="Times New Roman" w:cs="Times New Roman"/>
+          <w:i/>
+          <w:iCs/>
+        </w:rPr>
+        <w:t>Hydrilla verticillata</w:t>
+      </w:r>
+      <w:r>
+        <w:rPr>
+          <w:rFonts w:ascii="Times New Roman" w:hAnsi="Times New Roman" w:cs="Times New Roman"/>
+        </w:rPr>
+        <w:t xml:space="preserve"> </w:t>
+      </w:r>
+      <w:r>
+        <w:rPr>
+          <w:rFonts w:ascii="Times New Roman" w:hAnsi="Times New Roman" w:cs="Times New Roman"/>
+        </w:rPr>
+        <w:fldChar w:fldCharType="begin"/>
+      </w:r>
+      <w:r>
+        <w:rPr>
+          <w:rFonts w:ascii="Times New Roman" w:hAnsi="Times New Roman" w:cs="Times New Roman"/>
+        </w:rPr>
+        <w:instrText>ADDIN BEC{Kar and Choudhuri, 1986 #86993; Kar and Choudhuri, 1987 #71732}</w:instrText>
+      </w:r>
+      <w:r>
+        <w:rPr>
+          <w:rFonts w:ascii="Times New Roman" w:hAnsi="Times New Roman" w:cs="Times New Roman"/>
+        </w:rPr>
+        <w:fldChar w:fldCharType="separate"/>
+      </w:r>
+      <w:r>
+        <w:rPr>
+          <w:rFonts w:ascii="Times New Roman" w:hAnsi="Times New Roman" w:cs="Times New Roman"/>
+        </w:rPr>
+        <w:t>(Kar &amp; Choudhuri 1986, 1987)</w:t>
+      </w:r>
+      <w:r>
+        <w:rPr>
+          <w:rFonts w:ascii="Times New Roman" w:hAnsi="Times New Roman" w:cs="Times New Roman"/>
+        </w:rPr>
+        <w:fldChar w:fldCharType="end"/>
+      </w:r>
+      <w:r>
+        <w:rPr>
+          <w:rFonts w:ascii="Times New Roman" w:hAnsi="Times New Roman" w:cs="Times New Roman"/>
+        </w:rPr>
+        <w:t xml:space="preserve">, hydrogen peroxide production is exacerbated by photosynthesis, leading to light-induced chlorophyll degradation that is independent of photodegradation. Hence freshwater plants were the only group for which </w:t>
+      </w:r>
       <w:r>
         <w:rPr>
           <w:rFonts w:ascii="Times New Roman" w:hAnsi="Times New Roman" w:cs="Times New Roman"/>
         </w:rPr>
         <w:lastRenderedPageBreak/>
-        <w:t xml:space="preserve">can continue growing to a similar or greater extent relative to other seagrasses </w:t>
+        <w:t xml:space="preserve">I did not find a positive light effect on photosynthetic half-life. In contrast, there is no evidence for increased chlorophyll breakdown in isolated seagrass leaves exposed to light </w:t>
       </w:r>
       <w:r>
         <w:rPr>
@@ -13771,7 +15045,7 @@
         <w:rPr>
           <w:rFonts w:ascii="Times New Roman" w:hAnsi="Times New Roman" w:cs="Times New Roman"/>
         </w:rPr>
-        <w:instrText>ADDIN BEC{Hanuise et al., 2026 #276454}</w:instrText>
+        <w:instrText>ADDIN BEC{Strother and Vatta, 1986 #10310}</w:instrText>
       </w:r>
       <w:r>
         <w:rPr>
@@ -13783,7 +15057,7 @@
         <w:rPr>
           <w:rFonts w:ascii="Times New Roman" w:hAnsi="Times New Roman" w:cs="Times New Roman"/>
         </w:rPr>
-        <w:t>(Hanuise et al. 2026)</w:t>
+        <w:t>(Strother &amp; Vatta 1986)</w:t>
       </w:r>
       <w:r>
         <w:rPr>
@@ -13795,7 +15069,7 @@
         <w:rPr>
           <w:rFonts w:ascii="Times New Roman" w:hAnsi="Times New Roman" w:cs="Times New Roman"/>
         </w:rPr>
-        <w:t xml:space="preserve">. Despite such observations of apparent detrital growth for up to a month </w:t>
+        <w:t xml:space="preserve"> with photodegradation only being apparent in dead leaves </w:t>
       </w:r>
       <w:r>
         <w:rPr>
@@ -13807,7 +15081,7 @@
         <w:rPr>
           <w:rFonts w:ascii="Times New Roman" w:hAnsi="Times New Roman" w:cs="Times New Roman"/>
         </w:rPr>
-        <w:instrText>ADDIN BEC{Hanuise et al., 2026 #276454}</w:instrText>
+        <w:instrText>ADDIN BEC{Vähätalo et al., 1998 #73898}</w:instrText>
       </w:r>
       <w:r>
         <w:rPr>
@@ -13819,7 +15093,7 @@
         <w:rPr>
           <w:rFonts w:ascii="Times New Roman" w:hAnsi="Times New Roman" w:cs="Times New Roman"/>
         </w:rPr>
-        <w:t>(Hanuise et al. 2026)</w:t>
+        <w:t>(Vähätalo et al. 1998)</w:t>
       </w:r>
       <w:r>
         <w:rPr>
@@ -13831,7 +15105,7 @@
         <w:rPr>
           <w:rFonts w:ascii="Times New Roman" w:hAnsi="Times New Roman" w:cs="Times New Roman"/>
         </w:rPr>
-        <w:t xml:space="preserve"> and my evidence of photosynthetic persistence for a similar duration, seagrass detrital photosynthesis may not necessarily counteract decomposition. Seagrass detritus has a half-life of 68 days on average and complete decomposition may take a year </w:t>
+        <w:t xml:space="preserve">. Perhaps the answer lies in alterations to the light harvesting complexes and cell wall features of seagrass leaves that enhance gas exchange </w:t>
       </w:r>
       <w:r>
         <w:rPr>
@@ -13843,7 +15117,7 @@
         <w:rPr>
           <w:rFonts w:ascii="Times New Roman" w:hAnsi="Times New Roman" w:cs="Times New Roman"/>
         </w:rPr>
-        <w:instrText>ADDIN BEC{Harrison, 1989 #14810; Cebrián et al., 1997 #2780; Cebrián and Lartigue, 2004 #25396; Trevathan-Tackett et al., 2020 #39238}</w:instrText>
+        <w:instrText>ADDIN BEC{Olsen et al., 2016 #67412}</w:instrText>
       </w:r>
       <w:r>
         <w:rPr>
@@ -13855,7 +15129,7 @@
         <w:rPr>
           <w:rFonts w:ascii="Times New Roman" w:hAnsi="Times New Roman" w:cs="Times New Roman"/>
         </w:rPr>
-        <w:t>(Harrison 1989, Cebrián et al. 1997, Cebrián &amp; Lartigue 2004, Trevathan-Tackett et al. 2020)</w:t>
+        <w:t>(Olsen et al. 2016)</w:t>
       </w:r>
       <w:r>
         <w:rPr>
@@ -13867,31 +15141,29 @@
         <w:rPr>
           <w:rFonts w:ascii="Times New Roman" w:hAnsi="Times New Roman" w:cs="Times New Roman"/>
         </w:rPr>
-        <w:t xml:space="preserve">. While live </w:t>
-      </w:r>
-      <w:r>
-        <w:rPr>
-          <w:rFonts w:ascii="Times New Roman" w:hAnsi="Times New Roman" w:cs="Times New Roman"/>
-          <w:i/>
-          <w:iCs/>
-        </w:rPr>
-        <w:t xml:space="preserve">Halophila </w:t>
-      </w:r>
-      <w:proofErr w:type="spellStart"/>
-      <w:r>
-        <w:rPr>
-          <w:rFonts w:ascii="Times New Roman" w:hAnsi="Times New Roman" w:cs="Times New Roman"/>
-          <w:i/>
-          <w:iCs/>
-        </w:rPr>
-        <w:t>decipiens</w:t>
-      </w:r>
-      <w:proofErr w:type="spellEnd"/>
-      <w:r>
-        <w:rPr>
-          <w:rFonts w:ascii="Times New Roman" w:hAnsi="Times New Roman" w:cs="Times New Roman"/>
-        </w:rPr>
-        <w:t xml:space="preserve"> ramets do indeed decompose slower than buried ones </w:t>
+        <w:t>. Regardless, emancipation of leaf photosynthesis from the rest of the plant is apparently favoured by an aquatic but even more so by a marine lifestyle.</w:t>
+      </w:r>
+    </w:p>
+    <w:p>
+      <w:pPr>
+        <w:spacing w:line="360" w:lineRule="auto"/>
+        <w:rPr>
+          <w:rFonts w:ascii="Times New Roman" w:hAnsi="Times New Roman" w:cs="Times New Roman"/>
+        </w:rPr>
+      </w:pPr>
+    </w:p>
+    <w:p>
+      <w:pPr>
+        <w:spacing w:line="360" w:lineRule="auto"/>
+        <w:rPr>
+          <w:rFonts w:ascii="Times New Roman" w:hAnsi="Times New Roman" w:cs="Times New Roman"/>
+        </w:rPr>
+      </w:pPr>
+      <w:r>
+        <w:rPr>
+          <w:rFonts w:ascii="Times New Roman" w:hAnsi="Times New Roman" w:cs="Times New Roman"/>
+        </w:rPr>
+        <w:t xml:space="preserve">Macroalgal decomposition is uniquely determined by physiology. The influence of detrital photosynthesis on decomposition depends on its longevity relative to decomposition timescales. Of all considered plants, terrestrial ones decompose slowest and macroalgae decompose fastest, so the observed divergence in photosynthetic decay is increased when viewing it relative to decomposition. Macroalgae are the only plants whose detritus photosynthesises for as long as it remains intact, aquatic vascular plants maintain photosynthesis for a quarter of their detrital phase and terrestrial decomposition is unaffected by physiology due to a mismatch between rapid photosynthetic decay and slow decomposition. Since light increases photosynthetic half-life, detrital photosynthesis provides a mechanism contrary to photodegradation by which light slows macroalgal decomposition. Whether these predictions based on excision-induced senescence are realistic depends on the initial physiological state of detritus. Seagrass detritus often incudes green leaves </w:t>
       </w:r>
       <w:r>
         <w:rPr>
@@ -13903,7 +15175,7 @@
         <w:rPr>
           <w:rFonts w:ascii="Times New Roman" w:hAnsi="Times New Roman" w:cs="Times New Roman"/>
         </w:rPr>
-        <w:instrText>ADDIN BEC{Kenworthy et al., 1989 #80759}</w:instrText>
+        <w:instrText>ADDIN BEC{Knauer and Ayers, 1977 #11357; Ochieng and Erftemeijer, 1999 #55484; Jiménez-Ramos et al., 2023 #14803}</w:instrText>
       </w:r>
       <w:r>
         <w:rPr>
@@ -13915,7 +15187,7 @@
         <w:rPr>
           <w:rFonts w:ascii="Times New Roman" w:hAnsi="Times New Roman" w:cs="Times New Roman"/>
         </w:rPr>
-        <w:t>(Kenworthy et al. 1989)</w:t>
+        <w:t>(Knauer &amp; Ayers 1977, Ochieng &amp; Erftemeijer 1999, Jiménez-Ramos et al. 2023)</w:t>
       </w:r>
       <w:r>
         <w:rPr>
@@ -13927,41 +15199,7 @@
         <w:rPr>
           <w:rFonts w:ascii="Times New Roman" w:hAnsi="Times New Roman" w:cs="Times New Roman"/>
         </w:rPr>
-        <w:t xml:space="preserve">, decomposition rates are similar between live and senescent or buried </w:t>
-      </w:r>
-      <w:proofErr w:type="spellStart"/>
-      <w:r>
-        <w:rPr>
-          <w:rFonts w:ascii="Times New Roman" w:hAnsi="Times New Roman" w:cs="Times New Roman"/>
-          <w:i/>
-          <w:iCs/>
-        </w:rPr>
-        <w:t>Thalassia</w:t>
-      </w:r>
-      <w:proofErr w:type="spellEnd"/>
-      <w:r>
-        <w:rPr>
-          <w:rFonts w:ascii="Times New Roman" w:hAnsi="Times New Roman" w:cs="Times New Roman"/>
-          <w:i/>
-          <w:iCs/>
-        </w:rPr>
-        <w:t xml:space="preserve"> </w:t>
-      </w:r>
-      <w:proofErr w:type="spellStart"/>
-      <w:r>
-        <w:rPr>
-          <w:rFonts w:ascii="Times New Roman" w:hAnsi="Times New Roman" w:cs="Times New Roman"/>
-          <w:i/>
-          <w:iCs/>
-        </w:rPr>
-        <w:t>testudinum</w:t>
-      </w:r>
-      <w:proofErr w:type="spellEnd"/>
-      <w:r>
-        <w:rPr>
-          <w:rFonts w:ascii="Times New Roman" w:hAnsi="Times New Roman" w:cs="Times New Roman"/>
-        </w:rPr>
-        <w:t xml:space="preserve"> leaves </w:t>
+        <w:t xml:space="preserve">. This may in part be due to low nutrient resorption prior to abscission relative to terrestrial plants </w:t>
       </w:r>
       <w:r>
         <w:rPr>
@@ -13973,7 +15211,7 @@
         <w:rPr>
           <w:rFonts w:ascii="Times New Roman" w:hAnsi="Times New Roman" w:cs="Times New Roman"/>
         </w:rPr>
-        <w:instrText>ADDIN BEC{Rublee and Roman, 1982 #60679; Fourqurean and Schrlau, 2003 #17180; Rosch and Koch, 2009 #45001}</w:instrText>
+        <w:instrText>ADDIN BEC{Harrison, 1989 #14810; Pedersen and Borum, 1992 #13018; Pedersen et al., 1997 #44404; Hemminga et al., 1999 #2920; Rosch and Koch, 2009 #45001}</w:instrText>
       </w:r>
       <w:r>
         <w:rPr>
@@ -13985,7 +15223,7 @@
         <w:rPr>
           <w:rFonts w:ascii="Times New Roman" w:hAnsi="Times New Roman" w:cs="Times New Roman"/>
         </w:rPr>
-        <w:t>(Rublee &amp; Roman 1982, Fourqurean &amp; Schrlau 2003, Rosch &amp; Koch 2009)</w:t>
+        <w:t>(Harrison 1989, Pedersen &amp; Borum 1992, Pedersen et al. 1997, Hemminga et al. 1999, Rosch &amp; Koch 2009)</w:t>
       </w:r>
       <w:r>
         <w:rPr>
@@ -13997,7 +15235,7 @@
         <w:rPr>
           <w:rFonts w:ascii="Times New Roman" w:hAnsi="Times New Roman" w:cs="Times New Roman"/>
         </w:rPr>
-        <w:t xml:space="preserve"> and reviews suggest that live seagrass leaves actually tend to decompose faster than senescent or dead ones </w:t>
+        <w:t xml:space="preserve">. But the most likely mechanism is premature detachment caused by external factors such as hydrodynamics and herbivory </w:t>
       </w:r>
       <w:r>
         <w:rPr>
@@ -14009,7 +15247,7 @@
         <w:rPr>
           <w:rFonts w:ascii="Times New Roman" w:hAnsi="Times New Roman" w:cs="Times New Roman"/>
         </w:rPr>
-        <w:instrText>ADDIN BEC{Harrison, 1989 #14810; Trevathan-Tackett et al., 2020 #39238}</w:instrText>
+        <w:instrText>ADDIN BEC{Cebrián et al., 1997 #2780}</w:instrText>
       </w:r>
       <w:r>
         <w:rPr>
@@ -14021,7 +15259,7 @@
         <w:rPr>
           <w:rFonts w:ascii="Times New Roman" w:hAnsi="Times New Roman" w:cs="Times New Roman"/>
         </w:rPr>
-        <w:t>(Harrison 1989, Trevathan-Tackett et al. 2020)</w:t>
+        <w:t>(Cebrián et al. 1997)</w:t>
       </w:r>
       <w:r>
         <w:rPr>
@@ -14033,29 +15271,7 @@
         <w:rPr>
           <w:rFonts w:ascii="Times New Roman" w:hAnsi="Times New Roman" w:cs="Times New Roman"/>
         </w:rPr>
-        <w:t>.</w:t>
-      </w:r>
-    </w:p>
-    <w:p>
-      <w:pPr>
-        <w:spacing w:line="360" w:lineRule="auto"/>
-        <w:rPr>
-          <w:rFonts w:ascii="Times New Roman" w:hAnsi="Times New Roman" w:cs="Times New Roman"/>
-        </w:rPr>
-      </w:pPr>
-    </w:p>
-    <w:p>
-      <w:pPr>
-        <w:spacing w:line="360" w:lineRule="auto"/>
-        <w:rPr>
-          <w:rFonts w:ascii="Times New Roman" w:hAnsi="Times New Roman" w:cs="Times New Roman"/>
-        </w:rPr>
-      </w:pPr>
-      <w:r>
-        <w:rPr>
-          <w:rFonts w:ascii="Times New Roman" w:hAnsi="Times New Roman" w:cs="Times New Roman"/>
-        </w:rPr>
-        <w:t xml:space="preserve">Macroalgae uniquely exhibit long-term detrital photosynthesis, with extreme cases persisting up to a year. As expected from their aquatic lifestyle, seagrasses and freshwater plants exhibit intermediate detrital longevity between seaweeds and terrestrial plants, whose leaves photosynthesise for less than two weeks following excision. The extreme contrast to terrestrial plants has been demonstrated but is in fact somewhat dampened by my formal analysis. With access to light but not water, which is the normal fate of terrestrial plant detritus, detached leaves of various trees tend to lose the ability to photosynthesise in just a few minutes (e.g. </w:t>
+        <w:t xml:space="preserve"> paired with seasonal weakening of the ligule </w:t>
       </w:r>
       <w:r>
         <w:rPr>
@@ -14067,7 +15283,7 @@
         <w:rPr>
           <w:rFonts w:ascii="Times New Roman" w:hAnsi="Times New Roman" w:cs="Times New Roman"/>
         </w:rPr>
-        <w:instrText>ADDIN BEC{Gauthier and Jacobs, 2018 #82785; Kar et al., 2021 #107105}</w:instrText>
+        <w:instrText>ADDIN BEC{Jiménez-Ramos et al., 2023 #14803}</w:instrText>
       </w:r>
       <w:r>
         <w:rPr>
@@ -14079,7 +15295,7 @@
         <w:rPr>
           <w:rFonts w:ascii="Times New Roman" w:hAnsi="Times New Roman" w:cs="Times New Roman"/>
         </w:rPr>
-        <w:t>Gauthier &amp; Jacobs 2018, Kar et al. 2021)</w:t>
+        <w:t>(Jiménez-Ramos et al. 2023)</w:t>
       </w:r>
       <w:r>
         <w:rPr>
@@ -14091,7 +15307,7 @@
         <w:rPr>
           <w:rFonts w:ascii="Times New Roman" w:hAnsi="Times New Roman" w:cs="Times New Roman"/>
         </w:rPr>
-        <w:t xml:space="preserve"> due to breakdown of stomatal conductance following a loss in water pressure </w:t>
+        <w:t xml:space="preserve">. Seaweed detritus includes whole plants which are familiar as stranded wrack but many of which are not cast up on the beach to die </w:t>
       </w:r>
       <w:r>
         <w:rPr>
@@ -14103,7 +15319,7 @@
         <w:rPr>
           <w:rFonts w:ascii="Times New Roman" w:hAnsi="Times New Roman" w:cs="Times New Roman"/>
         </w:rPr>
-        <w:instrText>ADDIN BEC{Powles et al., 2006 #74407; Gauthier and Jacobs, 2018 #82785}</w:instrText>
+        <w:instrText>ADDIN BEC{Simpkins et al., 2025 #59214; van der Mheen et al., 2024 #3369; Krumhansl et al., 2025 #20399; Filbee-Dexter et al., 2024 #27978}</w:instrText>
       </w:r>
       <w:r>
         <w:rPr>
@@ -14115,7 +15331,7 @@
         <w:rPr>
           <w:rFonts w:ascii="Times New Roman" w:hAnsi="Times New Roman" w:cs="Times New Roman"/>
         </w:rPr>
-        <w:t>(Powles et al. 2006, Gauthier &amp; Jacobs 2018)</w:t>
+        <w:t>(Filbee-Dexter et al. 2024, van der Mheen et al. 2024, Krumhansl et al. 2025, Simpkins et al. 2025)</w:t>
       </w:r>
       <w:r>
         <w:rPr>
@@ -14127,21 +15343,7 @@
         <w:rPr>
           <w:rFonts w:ascii="Times New Roman" w:hAnsi="Times New Roman" w:cs="Times New Roman"/>
         </w:rPr>
-        <w:t xml:space="preserve">. Surprisingly seagrasses detritus tends to photosynthesise for longer than that of freshwater </w:t>
-      </w:r>
-      <w:proofErr w:type="spellStart"/>
-      <w:r>
-        <w:rPr>
-          <w:rFonts w:ascii="Times New Roman" w:hAnsi="Times New Roman" w:cs="Times New Roman"/>
-        </w:rPr>
-        <w:t>Alismatales</w:t>
-      </w:r>
-      <w:proofErr w:type="spellEnd"/>
-      <w:r>
-        <w:rPr>
-          <w:rFonts w:ascii="Times New Roman" w:hAnsi="Times New Roman" w:cs="Times New Roman"/>
-        </w:rPr>
-        <w:t xml:space="preserve">. The adoption of a marine lifestyle and convergent evolution with seaweeds </w:t>
+        <w:t xml:space="preserve">. Dislodged plants account for 26% (median, range = 5.6–74%) of kelp detrital production </w:t>
       </w:r>
       <w:r>
         <w:rPr>
@@ -14153,7 +15355,7 @@
         <w:rPr>
           <w:rFonts w:ascii="Times New Roman" w:hAnsi="Times New Roman" w:cs="Times New Roman"/>
         </w:rPr>
-        <w:instrText>ADDIN BEC{Olsen et al., 2016 #67412}</w:instrText>
+        <w:instrText>ADDIN BEC{Gerard, 1976 #44466; Newell et al., 1982 #9357; de Bettignies et al., 2013 #60107; Pessarrodona et al., 2018 #96145; Pedersen et al., 2020 #74604; Gilson et al., 2023 #95398}</w:instrText>
       </w:r>
       <w:r>
         <w:rPr>
@@ -14165,7 +15367,7 @@
         <w:rPr>
           <w:rFonts w:ascii="Times New Roman" w:hAnsi="Times New Roman" w:cs="Times New Roman"/>
         </w:rPr>
-        <w:t>(Olsen et al. 2016)</w:t>
+        <w:t>(Gerard 1976, Newell et al. 1982, de Bettignies et al. 2013, Pessarrodona et al. 2018, Pedersen et al. 2020, Gilson et al. 2023)</w:t>
       </w:r>
       <w:r>
         <w:rPr>
@@ -14177,7 +15379,7 @@
         <w:rPr>
           <w:rFonts w:ascii="Times New Roman" w:hAnsi="Times New Roman" w:cs="Times New Roman"/>
         </w:rPr>
-        <w:t xml:space="preserve"> may be the ultimate reason. But a more proximate explanation is excess production of hydrogen peroxide in detached freshwater plant leaves </w:t>
+        <w:t xml:space="preserve"> and are not expected to exhibit impaired photosynthesis like distally eroded or abscised tissues </w:t>
       </w:r>
       <w:r>
         <w:rPr>
@@ -14189,7 +15391,7 @@
         <w:rPr>
           <w:rFonts w:ascii="Times New Roman" w:hAnsi="Times New Roman" w:cs="Times New Roman"/>
         </w:rPr>
-        <w:instrText>ADDIN BEC{Jana and Choudhuri, 1982 #17463; Kar and Choudhuri, 1986 #86993; Kar and Choudhuri, 1987 #71732}</w:instrText>
+        <w:instrText>ADDIN BEC{Küppers and Kremer, 1978 #67857; Arnold and Manley, 1985 #57807; Rodriguez et al., 2016 #101441}</w:instrText>
       </w:r>
       <w:r>
         <w:rPr>
@@ -14201,7 +15403,7 @@
         <w:rPr>
           <w:rFonts w:ascii="Times New Roman" w:hAnsi="Times New Roman" w:cs="Times New Roman"/>
         </w:rPr>
-        <w:t>(Jana &amp; Choudhuri 1982, Kar &amp; Choudhuri 1986, 1987)</w:t>
+        <w:t>(Küppers &amp; Kremer 1978, Arnold &amp; Manley 1985, Rodriguez et al. 2016)</w:t>
       </w:r>
       <w:r>
         <w:rPr>
@@ -14213,21 +15415,36 @@
         <w:rPr>
           <w:rFonts w:ascii="Times New Roman" w:hAnsi="Times New Roman" w:cs="Times New Roman"/>
         </w:rPr>
-        <w:t xml:space="preserve">. As demonstrated for </w:t>
-      </w:r>
-      <w:r>
-        <w:rPr>
-          <w:rFonts w:ascii="Times New Roman" w:hAnsi="Times New Roman" w:cs="Times New Roman"/>
-          <w:i/>
-          <w:iCs/>
-        </w:rPr>
-        <w:t>Hydrilla verticillata</w:t>
-      </w:r>
-      <w:r>
-        <w:rPr>
-          <w:rFonts w:ascii="Times New Roman" w:hAnsi="Times New Roman" w:cs="Times New Roman"/>
-        </w:rPr>
-        <w:t xml:space="preserve"> </w:t>
+        <w:t xml:space="preserve">. Some </w:t>
+      </w:r>
+      <w:r>
+        <w:rPr>
+          <w:rFonts w:ascii="Times New Roman" w:hAnsi="Times New Roman" w:cs="Times New Roman"/>
+        </w:rPr>
+        <w:lastRenderedPageBreak/>
+        <w:t>viable seagrass and seaweed detritus is clearly produced in nature and will therefore follow the predictions of my model.</w:t>
+      </w:r>
+    </w:p>
+    <w:p>
+      <w:pPr>
+        <w:spacing w:line="360" w:lineRule="auto"/>
+        <w:rPr>
+          <w:rFonts w:ascii="Times New Roman" w:hAnsi="Times New Roman" w:cs="Times New Roman"/>
+        </w:rPr>
+      </w:pPr>
+    </w:p>
+    <w:p>
+      <w:pPr>
+        <w:spacing w:line="360" w:lineRule="auto"/>
+        <w:rPr>
+          <w:rFonts w:ascii="Times New Roman" w:hAnsi="Times New Roman" w:cs="Times New Roman"/>
+        </w:rPr>
+      </w:pPr>
+      <w:r>
+        <w:rPr>
+          <w:rFonts w:ascii="Times New Roman" w:hAnsi="Times New Roman" w:cs="Times New Roman"/>
+        </w:rPr>
+        <w:t xml:space="preserve">The theory of detrital photosynthesis is at odds with conventional understanding of the macroalgal carbon cycle. Seaweed blue carbon has been proposed as a substantial contributor to marine carbon sequestration </w:t>
       </w:r>
       <w:r>
         <w:rPr>
@@ -14239,7 +15456,7 @@
         <w:rPr>
           <w:rFonts w:ascii="Times New Roman" w:hAnsi="Times New Roman" w:cs="Times New Roman"/>
         </w:rPr>
-        <w:instrText>ADDIN BEC{Kar and Choudhuri, 1986 #86993; Kar and Choudhuri, 1987 #71732}</w:instrText>
+        <w:instrText>ADDIN BEC{Krause-Jensen and Duarte, 2016 #82158; Pessarrodona et al., 2023 #24777; Filbee-Dexter et al., 2024 #27978}</w:instrText>
       </w:r>
       <w:r>
         <w:rPr>
@@ -14251,7 +15468,7 @@
         <w:rPr>
           <w:rFonts w:ascii="Times New Roman" w:hAnsi="Times New Roman" w:cs="Times New Roman"/>
         </w:rPr>
-        <w:t>(Kar &amp; Choudhuri 1986, 1987)</w:t>
+        <w:t>(Krause-Jensen &amp; Duarte 2016, Pessarrodona et al. 2023, Filbee-Dexter et al. 2024)</w:t>
       </w:r>
       <w:r>
         <w:rPr>
@@ -14263,7 +15480,7 @@
         <w:rPr>
           <w:rFonts w:ascii="Times New Roman" w:hAnsi="Times New Roman" w:cs="Times New Roman"/>
         </w:rPr>
-        <w:t xml:space="preserve">, hydrogen peroxide production is exacerbated by photosynthesis, leading to light-induced chlorophyll degradation that is independent of photodegradation. Hence freshwater plants were the only group for which I did not find a positive light effect on photosynthetic half-life. In contrast, there is no evidence for increased chlorophyll breakdown in isolated seagrass leaves exposed to light </w:t>
+        <w:t xml:space="preserve">. Each proposed sequestration pathway </w:t>
       </w:r>
       <w:r>
         <w:rPr>
@@ -14275,7 +15492,7 @@
         <w:rPr>
           <w:rFonts w:ascii="Times New Roman" w:hAnsi="Times New Roman" w:cs="Times New Roman"/>
         </w:rPr>
-        <w:instrText>ADDIN BEC{Strother and Vatta, 1986 #10310}</w:instrText>
+        <w:instrText>ADDIN BEC{Pessarrodona et al., 2023 #24777}</w:instrText>
       </w:r>
       <w:r>
         <w:rPr>
@@ -14287,7 +15504,7 @@
         <w:rPr>
           <w:rFonts w:ascii="Times New Roman" w:hAnsi="Times New Roman" w:cs="Times New Roman"/>
         </w:rPr>
-        <w:t>(Strother &amp; Vatta 1986)</w:t>
+        <w:t>(Pessarrodona et al. 2023)</w:t>
       </w:r>
       <w:r>
         <w:rPr>
@@ -14299,7 +15516,7 @@
         <w:rPr>
           <w:rFonts w:ascii="Times New Roman" w:hAnsi="Times New Roman" w:cs="Times New Roman"/>
         </w:rPr>
-        <w:t xml:space="preserve"> with photodegradation only being apparent in dead leaves </w:t>
+        <w:t xml:space="preserve"> naturally hinges on decomposition. Even sequestration estimates based on deep ocean retention which does not discriminate between organic and inorganic carbon are affected by decomposition </w:t>
       </w:r>
       <w:r>
         <w:rPr>
@@ -14311,7 +15528,7 @@
         <w:rPr>
           <w:rFonts w:ascii="Times New Roman" w:hAnsi="Times New Roman" w:cs="Times New Roman"/>
         </w:rPr>
-        <w:instrText>ADDIN BEC{Vähätalo et al., 1998 #73898}</w:instrText>
+        <w:instrText>ADDIN BEC{Simpkins et al., 2025 #59214; van der Mheen et al., 2024 #3369; Filbee-Dexter et al., 2024 #27978; White and Norkko, 2025 #37663}</w:instrText>
       </w:r>
       <w:r>
         <w:rPr>
@@ -14323,7 +15540,7 @@
         <w:rPr>
           <w:rFonts w:ascii="Times New Roman" w:hAnsi="Times New Roman" w:cs="Times New Roman"/>
         </w:rPr>
-        <w:t>(Vähätalo et al. 1998)</w:t>
+        <w:t>(Filbee-Dexter et al. 2024, van der Mheen et al. 2024, Simpkins et al. 2025, White &amp; Norkko 2025)</w:t>
       </w:r>
       <w:r>
         <w:rPr>
@@ -14335,700 +15552,252 @@
         <w:rPr>
           <w:rFonts w:ascii="Times New Roman" w:hAnsi="Times New Roman" w:cs="Times New Roman"/>
         </w:rPr>
-        <w:t xml:space="preserve">. </w:t>
+        <w:t xml:space="preserve">. I have previously suggested that detrital photosynthesis is an important determinant of kelp decomposition </w:t>
+      </w:r>
+      <w:r>
+        <w:rPr>
+          <w:rFonts w:ascii="Times New Roman" w:hAnsi="Times New Roman" w:cs="Times New Roman"/>
+        </w:rPr>
+        <w:fldChar w:fldCharType="begin"/>
+      </w:r>
+      <w:r>
+        <w:rPr>
+          <w:rFonts w:ascii="Times New Roman" w:hAnsi="Times New Roman" w:cs="Times New Roman"/>
+        </w:rPr>
+        <w:instrText>ADDIN BEC{Wright et al., 2022 #84779; Wright et al., 2024 #11375}</w:instrText>
+      </w:r>
+      <w:r>
+        <w:rPr>
+          <w:rFonts w:ascii="Times New Roman" w:hAnsi="Times New Roman" w:cs="Times New Roman"/>
+        </w:rPr>
+        <w:fldChar w:fldCharType="separate"/>
+      </w:r>
+      <w:r>
+        <w:rPr>
+          <w:rFonts w:ascii="Times New Roman" w:hAnsi="Times New Roman" w:cs="Times New Roman"/>
+        </w:rPr>
+        <w:t>(Wright et al. 2022, 2024)</w:t>
+      </w:r>
+      <w:r>
+        <w:rPr>
+          <w:rFonts w:ascii="Times New Roman" w:hAnsi="Times New Roman" w:cs="Times New Roman"/>
+        </w:rPr>
+        <w:fldChar w:fldCharType="end"/>
+      </w:r>
+      <w:r>
+        <w:rPr>
+          <w:rFonts w:ascii="Times New Roman" w:hAnsi="Times New Roman" w:cs="Times New Roman"/>
+        </w:rPr>
+        <w:t xml:space="preserve"> and have here shown this effect to be unique to macroalgae. The key implication is that seaweed decomposition is not comparable to that of other plants. Due to enormous physiological variation in seaweed detritus, as shown here, it is even hard to compare decomposition within seaweeds when not explicitly accounting for detrital photosynthesis </w:t>
+      </w:r>
+      <w:r>
+        <w:rPr>
+          <w:rFonts w:ascii="Times New Roman" w:hAnsi="Times New Roman" w:cs="Times New Roman"/>
+        </w:rPr>
+        <w:fldChar w:fldCharType="begin"/>
+      </w:r>
+      <w:r>
+        <w:rPr>
+          <w:rFonts w:ascii="Times New Roman" w:hAnsi="Times New Roman" w:cs="Times New Roman"/>
+        </w:rPr>
+        <w:instrText>ADDIN BEC{Wright et al., 2022 #84779; Kennedy and Blain, 2025 #108523; White and Norkko, 2025 #37663}</w:instrText>
+      </w:r>
+      <w:r>
+        <w:rPr>
+          <w:rFonts w:ascii="Times New Roman" w:hAnsi="Times New Roman" w:cs="Times New Roman"/>
+        </w:rPr>
+        <w:fldChar w:fldCharType="separate"/>
+      </w:r>
+      <w:r>
+        <w:rPr>
+          <w:rFonts w:ascii="Times New Roman" w:hAnsi="Times New Roman" w:cs="Times New Roman"/>
+        </w:rPr>
+        <w:t>(Wright et al. 2022, Kennedy &amp; Blain 2025, White &amp; Norkko 2025)</w:t>
+      </w:r>
+      <w:r>
+        <w:rPr>
+          <w:rFonts w:ascii="Times New Roman" w:hAnsi="Times New Roman" w:cs="Times New Roman"/>
+        </w:rPr>
+        <w:fldChar w:fldCharType="end"/>
+      </w:r>
+      <w:r>
+        <w:rPr>
+          <w:rFonts w:ascii="Times New Roman" w:hAnsi="Times New Roman" w:cs="Times New Roman"/>
+        </w:rPr>
+        <w:t xml:space="preserve">. Most of our understanding of seaweed decomposition is based on freshly excised blades </w:t>
+      </w:r>
+      <w:r>
+        <w:rPr>
+          <w:rFonts w:ascii="Times New Roman" w:hAnsi="Times New Roman" w:cs="Times New Roman"/>
+        </w:rPr>
+        <w:fldChar w:fldCharType="begin"/>
+      </w:r>
+      <w:r>
+        <w:rPr>
+          <w:rFonts w:ascii="Times New Roman" w:hAnsi="Times New Roman" w:cs="Times New Roman"/>
+        </w:rPr>
+        <w:instrText>ADDIN BEC{Frontier et al., 2021 #5570; Frontier et al., 2022 #81381; Wright et al., 2022 #84779; Filbee-Dexter et al., 2022 #89942; Kennedy and Blain, 2025 #108523; White and Norkko, 2025 #37663}</w:instrText>
+      </w:r>
+      <w:r>
+        <w:rPr>
+          <w:rFonts w:ascii="Times New Roman" w:hAnsi="Times New Roman" w:cs="Times New Roman"/>
+        </w:rPr>
+        <w:fldChar w:fldCharType="separate"/>
+      </w:r>
+      <w:r>
+        <w:rPr>
+          <w:rFonts w:ascii="Times New Roman" w:hAnsi="Times New Roman" w:cs="Times New Roman"/>
+        </w:rPr>
+        <w:t>(Frontier et al. 2021, Filbee-Dexter et al. 2022, Frontier et al. 2022, Wright et al. 2022, Kennedy &amp; Blain 2025, White &amp; Norkko 2025)</w:t>
+      </w:r>
+      <w:r>
+        <w:rPr>
+          <w:rFonts w:ascii="Times New Roman" w:hAnsi="Times New Roman" w:cs="Times New Roman"/>
+        </w:rPr>
+        <w:fldChar w:fldCharType="end"/>
+      </w:r>
+      <w:r>
+        <w:rPr>
+          <w:rFonts w:ascii="Times New Roman" w:hAnsi="Times New Roman" w:cs="Times New Roman"/>
+        </w:rPr>
+        <w:t xml:space="preserve"> as opposed to senescent fronds </w:t>
+      </w:r>
+      <w:r>
+        <w:rPr>
+          <w:rFonts w:ascii="Times New Roman" w:hAnsi="Times New Roman" w:cs="Times New Roman"/>
+        </w:rPr>
+        <w:fldChar w:fldCharType="begin"/>
+      </w:r>
+      <w:r>
+        <w:rPr>
+          <w:rFonts w:ascii="Times New Roman" w:hAnsi="Times New Roman" w:cs="Times New Roman"/>
+        </w:rPr>
+        <w:instrText>ADDIN BEC{Hamersley et al., 2015 #100188; de Bettignies et al., 2020 #27484}</w:instrText>
+      </w:r>
+      <w:r>
+        <w:rPr>
+          <w:rFonts w:ascii="Times New Roman" w:hAnsi="Times New Roman" w:cs="Times New Roman"/>
+        </w:rPr>
+        <w:fldChar w:fldCharType="separate"/>
+      </w:r>
+      <w:r>
+        <w:rPr>
+          <w:rFonts w:ascii="Times New Roman" w:hAnsi="Times New Roman" w:cs="Times New Roman"/>
+        </w:rPr>
+        <w:t>(Hamersley et al. 2015, de Bettignies et al. 2020)</w:t>
+      </w:r>
+      <w:r>
+        <w:rPr>
+          <w:rFonts w:ascii="Times New Roman" w:hAnsi="Times New Roman" w:cs="Times New Roman"/>
+        </w:rPr>
+        <w:fldChar w:fldCharType="end"/>
+      </w:r>
+      <w:r>
+        <w:rPr>
+          <w:rFonts w:ascii="Times New Roman" w:hAnsi="Times New Roman" w:cs="Times New Roman"/>
+        </w:rPr>
+        <w:t xml:space="preserve"> or dead tissue </w:t>
+      </w:r>
+      <w:r>
+        <w:rPr>
+          <w:rFonts w:ascii="Times New Roman" w:hAnsi="Times New Roman" w:cs="Times New Roman"/>
+        </w:rPr>
+        <w:fldChar w:fldCharType="begin"/>
+      </w:r>
+      <w:r>
+        <w:rPr>
+          <w:rFonts w:ascii="Times New Roman" w:hAnsi="Times New Roman" w:cs="Times New Roman"/>
+        </w:rPr>
+        <w:instrText>ADDIN BEC{Josselyn and Mathieson, 1980 #46927; Rice and Tenore, 1981 #62280; Birch et al., 1983 #5321; Smith and Foreman, 1984 #41137; Brouwer, 1996 #26706}</w:instrText>
+      </w:r>
+      <w:r>
+        <w:rPr>
+          <w:rFonts w:ascii="Times New Roman" w:hAnsi="Times New Roman" w:cs="Times New Roman"/>
+        </w:rPr>
+        <w:fldChar w:fldCharType="separate"/>
+      </w:r>
+      <w:r>
+        <w:rPr>
+          <w:rFonts w:ascii="Times New Roman" w:hAnsi="Times New Roman" w:cs="Times New Roman"/>
+        </w:rPr>
+        <w:t>(Josselyn &amp; Mathieson 1980, Rice &amp; Tenore 1981, Birch et al. 1983, Smith &amp; Foreman 1984, Brouwer 1996)</w:t>
+      </w:r>
+      <w:r>
+        <w:rPr>
+          <w:rFonts w:ascii="Times New Roman" w:hAnsi="Times New Roman" w:cs="Times New Roman"/>
+        </w:rPr>
+        <w:fldChar w:fldCharType="end"/>
+      </w:r>
+      <w:r>
+        <w:rPr>
+          <w:rFonts w:ascii="Times New Roman" w:hAnsi="Times New Roman" w:cs="Times New Roman"/>
+        </w:rPr>
+        <w:t xml:space="preserve">. But as mentioned, only around 26% of seaweed detritus can be considered fully viable when exported. Additionally, decomposition experiments are usually carried out in mesocosms or the shallow subtidal with access to light, but seaweed carbon sinks are often said to be found in the darkness of the deep sea </w:t>
+      </w:r>
+      <w:r>
+        <w:rPr>
+          <w:rFonts w:ascii="Times New Roman" w:hAnsi="Times New Roman" w:cs="Times New Roman"/>
+        </w:rPr>
+        <w:fldChar w:fldCharType="begin"/>
+      </w:r>
+      <w:r>
+        <w:rPr>
+          <w:rFonts w:ascii="Times New Roman" w:hAnsi="Times New Roman" w:cs="Times New Roman"/>
+        </w:rPr>
+        <w:instrText>ADDIN BEC{Krause-Jensen and Duarte, 2016 #82158; Filbee-Dexter et al., 2024 #27978; Simpkins et al., 2025 #59214; van der Mheen et al., 2024 #3369; Krumhansl et al., 2025 #20399}</w:instrText>
+      </w:r>
+      <w:r>
+        <w:rPr>
+          <w:rFonts w:ascii="Times New Roman" w:hAnsi="Times New Roman" w:cs="Times New Roman"/>
+        </w:rPr>
+        <w:fldChar w:fldCharType="separate"/>
+      </w:r>
+      <w:r>
+        <w:rPr>
+          <w:rFonts w:ascii="Times New Roman" w:hAnsi="Times New Roman" w:cs="Times New Roman"/>
+        </w:rPr>
+        <w:t>(Krause-Jensen &amp; Duarte 2016, Filbee-Dexter et al. 2024, van der Mheen et al. 2024, Krumhansl et al. 2025, Simpkins et al. 2025)</w:t>
+      </w:r>
+      <w:r>
+        <w:rPr>
+          <w:rFonts w:ascii="Times New Roman" w:hAnsi="Times New Roman" w:cs="Times New Roman"/>
+        </w:rPr>
+        <w:fldChar w:fldCharType="end"/>
+      </w:r>
+      <w:r>
+        <w:rPr>
+          <w:rFonts w:ascii="Times New Roman" w:hAnsi="Times New Roman" w:cs="Times New Roman"/>
+        </w:rPr>
+        <w:t>. My meta-analysis suggests that darkness has a detrimental effect on the detrital photosynthesis of seaweeds, thus accelerating their decomposition. Perhaps it is time to question existing preconceptions in macroalgal blue carbon.</w:t>
+      </w:r>
+    </w:p>
+    <w:p>
+      <w:pPr>
+        <w:spacing w:line="360" w:lineRule="auto"/>
+        <w:rPr>
+          <w:rFonts w:ascii="Times New Roman" w:hAnsi="Times New Roman" w:cs="Times New Roman"/>
+        </w:rPr>
+      </w:pPr>
+    </w:p>
+    <w:p>
+      <w:pPr>
+        <w:spacing w:line="360" w:lineRule="auto"/>
+        <w:rPr>
+          <w:rFonts w:ascii="Times New Roman" w:hAnsi="Times New Roman" w:cs="Times New Roman"/>
+        </w:rPr>
+      </w:pPr>
+      <w:r>
+        <w:rPr>
+          <w:rFonts w:ascii="Times New Roman" w:hAnsi="Times New Roman" w:cs="Times New Roman"/>
+        </w:rPr>
+        <w:t xml:space="preserve">To conclude, I show that all plants may photosynthesise following detachment, but timescales vary greatly from a few minutes in tree leaves without access to water to a year for certain </w:t>
       </w:r>
       <w:r>
         <w:rPr>
           <w:rFonts w:ascii="Times New Roman" w:hAnsi="Times New Roman" w:cs="Times New Roman"/>
         </w:rPr>
         <w:lastRenderedPageBreak/>
-        <w:t xml:space="preserve">Perhaps the answer lies in alterations to the light harvesting complexes and cell wall features of seagrass leaves that enhance gas exchange </w:t>
-      </w:r>
-      <w:r>
-        <w:rPr>
-          <w:rFonts w:ascii="Times New Roman" w:hAnsi="Times New Roman" w:cs="Times New Roman"/>
-        </w:rPr>
-        <w:fldChar w:fldCharType="begin"/>
-      </w:r>
-      <w:r>
-        <w:rPr>
-          <w:rFonts w:ascii="Times New Roman" w:hAnsi="Times New Roman" w:cs="Times New Roman"/>
-        </w:rPr>
-        <w:instrText>ADDIN BEC{Olsen et al., 2016 #67412}</w:instrText>
-      </w:r>
-      <w:r>
-        <w:rPr>
-          <w:rFonts w:ascii="Times New Roman" w:hAnsi="Times New Roman" w:cs="Times New Roman"/>
-        </w:rPr>
-        <w:fldChar w:fldCharType="separate"/>
-      </w:r>
-      <w:r>
-        <w:rPr>
-          <w:rFonts w:ascii="Times New Roman" w:hAnsi="Times New Roman" w:cs="Times New Roman"/>
-        </w:rPr>
-        <w:t>(Olsen et al. 2016)</w:t>
-      </w:r>
-      <w:r>
-        <w:rPr>
-          <w:rFonts w:ascii="Times New Roman" w:hAnsi="Times New Roman" w:cs="Times New Roman"/>
-        </w:rPr>
-        <w:fldChar w:fldCharType="end"/>
-      </w:r>
-      <w:r>
-        <w:rPr>
-          <w:rFonts w:ascii="Times New Roman" w:hAnsi="Times New Roman" w:cs="Times New Roman"/>
-        </w:rPr>
-        <w:t>. Regardless, emancipation of leaf photosynthesis from the rest of the plant is apparently favoured by an aquatic but even more so by a marine lifestyle.</w:t>
-      </w:r>
-    </w:p>
-    <w:p>
-      <w:pPr>
-        <w:spacing w:line="360" w:lineRule="auto"/>
-        <w:rPr>
-          <w:rFonts w:ascii="Times New Roman" w:hAnsi="Times New Roman" w:cs="Times New Roman"/>
-        </w:rPr>
-      </w:pPr>
-    </w:p>
-    <w:p>
-      <w:pPr>
-        <w:spacing w:line="360" w:lineRule="auto"/>
-        <w:rPr>
-          <w:rFonts w:ascii="Times New Roman" w:hAnsi="Times New Roman" w:cs="Times New Roman"/>
-        </w:rPr>
-      </w:pPr>
-      <w:r>
-        <w:rPr>
-          <w:rFonts w:ascii="Times New Roman" w:hAnsi="Times New Roman" w:cs="Times New Roman"/>
-        </w:rPr>
-        <w:t xml:space="preserve">Macroalgal decomposition is uniquely determined by physiology. The influence of detrital photosynthesis on decomposition depends on its longevity relative to decomposition timescales. Of all considered plants, terrestrial ones decompose slowest and macroalgae decompose fastest, so the observed divergence in photosynthetic decay is increased when viewing it relative to decomposition. Macroalgae are the only plants whose detritus photosynthesises for as long as it remains intact, aquatic vascular plants maintain photosynthesis for a quarter of their detrital phase and terrestrial decomposition is unaffected by physiology due to a mismatch between rapid photosynthetic decay and slow decomposition. Since light increases photosynthetic half-life, detrital photosynthesis provides a mechanism contrary to photodegradation by which light slows macroalgal decomposition. Whether these predictions based on excision-induced senescence are realistic depends on the initial physiological state of detritus. Seagrass detritus often incudes green leaves </w:t>
-      </w:r>
-      <w:r>
-        <w:rPr>
-          <w:rFonts w:ascii="Times New Roman" w:hAnsi="Times New Roman" w:cs="Times New Roman"/>
-        </w:rPr>
-        <w:fldChar w:fldCharType="begin"/>
-      </w:r>
-      <w:r>
-        <w:rPr>
-          <w:rFonts w:ascii="Times New Roman" w:hAnsi="Times New Roman" w:cs="Times New Roman"/>
-        </w:rPr>
-        <w:instrText>ADDIN BEC{Knauer and Ayers, 1977 #11357; Ochieng and Erftemeijer, 1999 #55484; Jiménez-Ramos et al., 2023 #14803}</w:instrText>
-      </w:r>
-      <w:r>
-        <w:rPr>
-          <w:rFonts w:ascii="Times New Roman" w:hAnsi="Times New Roman" w:cs="Times New Roman"/>
-        </w:rPr>
-        <w:fldChar w:fldCharType="separate"/>
-      </w:r>
-      <w:r>
-        <w:rPr>
-          <w:rFonts w:ascii="Times New Roman" w:hAnsi="Times New Roman" w:cs="Times New Roman"/>
-        </w:rPr>
-        <w:t>(Knauer &amp; Ayers 1977, Ochieng &amp; Erftemeijer 1999, Jiménez-Ramos et al. 2023)</w:t>
-      </w:r>
-      <w:r>
-        <w:rPr>
-          <w:rFonts w:ascii="Times New Roman" w:hAnsi="Times New Roman" w:cs="Times New Roman"/>
-        </w:rPr>
-        <w:fldChar w:fldCharType="end"/>
-      </w:r>
-      <w:r>
-        <w:rPr>
-          <w:rFonts w:ascii="Times New Roman" w:hAnsi="Times New Roman" w:cs="Times New Roman"/>
-        </w:rPr>
-        <w:t xml:space="preserve">. This may in part be due to low nutrient resorption prior to abscission relative to terrestrial plants </w:t>
-      </w:r>
-      <w:r>
-        <w:rPr>
-          <w:rFonts w:ascii="Times New Roman" w:hAnsi="Times New Roman" w:cs="Times New Roman"/>
-        </w:rPr>
-        <w:fldChar w:fldCharType="begin"/>
-      </w:r>
-      <w:r>
-        <w:rPr>
-          <w:rFonts w:ascii="Times New Roman" w:hAnsi="Times New Roman" w:cs="Times New Roman"/>
-        </w:rPr>
-        <w:instrText>ADDIN BEC{Harrison, 1989 #14810; Pedersen and Borum, 1992 #13018; Pedersen et al., 1997 #44404; Hemminga et al., 1999 #2920; Rosch and Koch, 2009 #45001}</w:instrText>
-      </w:r>
-      <w:r>
-        <w:rPr>
-          <w:rFonts w:ascii="Times New Roman" w:hAnsi="Times New Roman" w:cs="Times New Roman"/>
-        </w:rPr>
-        <w:fldChar w:fldCharType="separate"/>
-      </w:r>
-      <w:r>
-        <w:rPr>
-          <w:rFonts w:ascii="Times New Roman" w:hAnsi="Times New Roman" w:cs="Times New Roman"/>
-        </w:rPr>
-        <w:t>(Harrison 1989, Pedersen &amp; Borum 1992, Pedersen et al. 1997, Hemminga et al. 1999, Rosch &amp; Koch 2009)</w:t>
-      </w:r>
-      <w:r>
-        <w:rPr>
-          <w:rFonts w:ascii="Times New Roman" w:hAnsi="Times New Roman" w:cs="Times New Roman"/>
-        </w:rPr>
-        <w:fldChar w:fldCharType="end"/>
-      </w:r>
-      <w:r>
-        <w:rPr>
-          <w:rFonts w:ascii="Times New Roman" w:hAnsi="Times New Roman" w:cs="Times New Roman"/>
-        </w:rPr>
-        <w:t xml:space="preserve">. But the most likely mechanism is premature detachment caused by external factors such as hydrodynamics and herbivory </w:t>
-      </w:r>
-      <w:r>
-        <w:rPr>
-          <w:rFonts w:ascii="Times New Roman" w:hAnsi="Times New Roman" w:cs="Times New Roman"/>
-        </w:rPr>
-        <w:fldChar w:fldCharType="begin"/>
-      </w:r>
-      <w:r>
-        <w:rPr>
-          <w:rFonts w:ascii="Times New Roman" w:hAnsi="Times New Roman" w:cs="Times New Roman"/>
-        </w:rPr>
-        <w:instrText>ADDIN BEC{Cebrián et al., 1997 #2780}</w:instrText>
-      </w:r>
-      <w:r>
-        <w:rPr>
-          <w:rFonts w:ascii="Times New Roman" w:hAnsi="Times New Roman" w:cs="Times New Roman"/>
-        </w:rPr>
-        <w:fldChar w:fldCharType="separate"/>
-      </w:r>
-      <w:r>
-        <w:rPr>
-          <w:rFonts w:ascii="Times New Roman" w:hAnsi="Times New Roman" w:cs="Times New Roman"/>
-        </w:rPr>
-        <w:t>(Cebrián et al. 1997)</w:t>
-      </w:r>
-      <w:r>
-        <w:rPr>
-          <w:rFonts w:ascii="Times New Roman" w:hAnsi="Times New Roman" w:cs="Times New Roman"/>
-        </w:rPr>
-        <w:fldChar w:fldCharType="end"/>
-      </w:r>
-      <w:r>
-        <w:rPr>
-          <w:rFonts w:ascii="Times New Roman" w:hAnsi="Times New Roman" w:cs="Times New Roman"/>
-        </w:rPr>
-        <w:t xml:space="preserve"> paired with seasonal weakening of the ligule </w:t>
-      </w:r>
-      <w:r>
-        <w:rPr>
-          <w:rFonts w:ascii="Times New Roman" w:hAnsi="Times New Roman" w:cs="Times New Roman"/>
-        </w:rPr>
-        <w:fldChar w:fldCharType="begin"/>
-      </w:r>
-      <w:r>
-        <w:rPr>
-          <w:rFonts w:ascii="Times New Roman" w:hAnsi="Times New Roman" w:cs="Times New Roman"/>
-        </w:rPr>
-        <w:instrText>ADDIN BEC{Jiménez-Ramos et al., 2023 #14803}</w:instrText>
-      </w:r>
-      <w:r>
-        <w:rPr>
-          <w:rFonts w:ascii="Times New Roman" w:hAnsi="Times New Roman" w:cs="Times New Roman"/>
-        </w:rPr>
-        <w:fldChar w:fldCharType="separate"/>
-      </w:r>
-      <w:r>
-        <w:rPr>
-          <w:rFonts w:ascii="Times New Roman" w:hAnsi="Times New Roman" w:cs="Times New Roman"/>
-        </w:rPr>
-        <w:t>(Jiménez-Ramos et al. 2023)</w:t>
-      </w:r>
-      <w:r>
-        <w:rPr>
-          <w:rFonts w:ascii="Times New Roman" w:hAnsi="Times New Roman" w:cs="Times New Roman"/>
-        </w:rPr>
-        <w:fldChar w:fldCharType="end"/>
-      </w:r>
-      <w:r>
-        <w:rPr>
-          <w:rFonts w:ascii="Times New Roman" w:hAnsi="Times New Roman" w:cs="Times New Roman"/>
-        </w:rPr>
-        <w:t xml:space="preserve">. Seaweed detritus includes whole plants which are familiar as stranded wrack but many of which are not cast up on the beach to die </w:t>
-      </w:r>
-      <w:r>
-        <w:rPr>
-          <w:rFonts w:ascii="Times New Roman" w:hAnsi="Times New Roman" w:cs="Times New Roman"/>
-        </w:rPr>
-        <w:fldChar w:fldCharType="begin"/>
-      </w:r>
-      <w:r>
-        <w:rPr>
-          <w:rFonts w:ascii="Times New Roman" w:hAnsi="Times New Roman" w:cs="Times New Roman"/>
-        </w:rPr>
-        <w:instrText>ADDIN BEC{Simpkins et al., 2025 #59214; van der Mheen et al., 2024 #3369; Krumhansl et al., 2025 #20399; Filbee-Dexter et al., 2024 #27978}</w:instrText>
-      </w:r>
-      <w:r>
-        <w:rPr>
-          <w:rFonts w:ascii="Times New Roman" w:hAnsi="Times New Roman" w:cs="Times New Roman"/>
-        </w:rPr>
-        <w:fldChar w:fldCharType="separate"/>
-      </w:r>
-      <w:r>
-        <w:rPr>
-          <w:rFonts w:ascii="Times New Roman" w:hAnsi="Times New Roman" w:cs="Times New Roman"/>
-        </w:rPr>
-        <w:t>(Filbee-Dexter et al. 2024, van der Mheen et al. 2024, Krumhansl et al. 2025, Simpkins et al. 2025)</w:t>
-      </w:r>
-      <w:r>
-        <w:rPr>
-          <w:rFonts w:ascii="Times New Roman" w:hAnsi="Times New Roman" w:cs="Times New Roman"/>
-        </w:rPr>
-        <w:fldChar w:fldCharType="end"/>
-      </w:r>
-      <w:r>
-        <w:rPr>
-          <w:rFonts w:ascii="Times New Roman" w:hAnsi="Times New Roman" w:cs="Times New Roman"/>
-        </w:rPr>
-        <w:t xml:space="preserve">. Dislodged plants account for 26% (median, range = 5.6–74%) of kelp detrital production </w:t>
-      </w:r>
-      <w:r>
-        <w:rPr>
-          <w:rFonts w:ascii="Times New Roman" w:hAnsi="Times New Roman" w:cs="Times New Roman"/>
-        </w:rPr>
-        <w:fldChar w:fldCharType="begin"/>
-      </w:r>
-      <w:r>
-        <w:rPr>
-          <w:rFonts w:ascii="Times New Roman" w:hAnsi="Times New Roman" w:cs="Times New Roman"/>
-        </w:rPr>
-        <w:instrText>ADDIN BEC{Gerard, 1976 #44466; Newell et al., 1982 #9357; de Bettignies et al., 2013 #60107; Pessarrodona et al., 2018 #96145; Pedersen et al., 2020 #74604; Gilson et al., 2023 #95398}</w:instrText>
-      </w:r>
-      <w:r>
-        <w:rPr>
-          <w:rFonts w:ascii="Times New Roman" w:hAnsi="Times New Roman" w:cs="Times New Roman"/>
-        </w:rPr>
-        <w:fldChar w:fldCharType="separate"/>
-      </w:r>
-      <w:r>
-        <w:rPr>
-          <w:rFonts w:ascii="Times New Roman" w:hAnsi="Times New Roman" w:cs="Times New Roman"/>
-        </w:rPr>
-        <w:t>(Gerard 1976, Newell et al. 1982, de Bettignies et al. 2013, Pessarrodona et al. 2018, Pedersen et al. 2020, Gilson et al. 2023)</w:t>
-      </w:r>
-      <w:r>
-        <w:rPr>
-          <w:rFonts w:ascii="Times New Roman" w:hAnsi="Times New Roman" w:cs="Times New Roman"/>
-        </w:rPr>
-        <w:fldChar w:fldCharType="end"/>
-      </w:r>
-      <w:r>
-        <w:rPr>
-          <w:rFonts w:ascii="Times New Roman" w:hAnsi="Times New Roman" w:cs="Times New Roman"/>
-        </w:rPr>
-        <w:t xml:space="preserve"> and are not expected to exhibit impaired photosynthesis like distally eroded or abscised tissues </w:t>
-      </w:r>
-      <w:r>
-        <w:rPr>
-          <w:rFonts w:ascii="Times New Roman" w:hAnsi="Times New Roman" w:cs="Times New Roman"/>
-        </w:rPr>
-        <w:fldChar w:fldCharType="begin"/>
-      </w:r>
-      <w:r>
-        <w:rPr>
-          <w:rFonts w:ascii="Times New Roman" w:hAnsi="Times New Roman" w:cs="Times New Roman"/>
-        </w:rPr>
-        <w:instrText>ADDIN BEC{Küppers and Kremer, 1978 #67857; Arnold and Manley, 1985 #57807; Rodriguez et al., 2016 #101441}</w:instrText>
-      </w:r>
-      <w:r>
-        <w:rPr>
-          <w:rFonts w:ascii="Times New Roman" w:hAnsi="Times New Roman" w:cs="Times New Roman"/>
-        </w:rPr>
-        <w:fldChar w:fldCharType="separate"/>
-      </w:r>
-      <w:r>
-        <w:rPr>
-          <w:rFonts w:ascii="Times New Roman" w:hAnsi="Times New Roman" w:cs="Times New Roman"/>
-        </w:rPr>
-        <w:t>(Küppers &amp; Kremer 1978, Arnold &amp; Manley 1985, Rodriguez et al. 2016)</w:t>
-      </w:r>
-      <w:r>
-        <w:rPr>
-          <w:rFonts w:ascii="Times New Roman" w:hAnsi="Times New Roman" w:cs="Times New Roman"/>
-        </w:rPr>
-        <w:fldChar w:fldCharType="end"/>
-      </w:r>
-      <w:r>
-        <w:rPr>
-          <w:rFonts w:ascii="Times New Roman" w:hAnsi="Times New Roman" w:cs="Times New Roman"/>
-        </w:rPr>
-        <w:t>. Some viable seagrass and seaweed detritus is clearly produced in nature and will therefore follow the predictions of my model.</w:t>
-      </w:r>
-    </w:p>
-    <w:p>
-      <w:pPr>
-        <w:spacing w:line="360" w:lineRule="auto"/>
-        <w:rPr>
-          <w:rFonts w:ascii="Times New Roman" w:hAnsi="Times New Roman" w:cs="Times New Roman"/>
-        </w:rPr>
-      </w:pPr>
-    </w:p>
-    <w:p>
-      <w:pPr>
-        <w:spacing w:line="360" w:lineRule="auto"/>
-        <w:rPr>
-          <w:rFonts w:ascii="Times New Roman" w:hAnsi="Times New Roman" w:cs="Times New Roman"/>
-        </w:rPr>
-      </w:pPr>
-      <w:r>
-        <w:rPr>
-          <w:rFonts w:ascii="Times New Roman" w:hAnsi="Times New Roman" w:cs="Times New Roman"/>
-        </w:rPr>
-        <w:lastRenderedPageBreak/>
-        <w:t xml:space="preserve">The theory of detrital photosynthesis is at odds with conventional understanding of the macroalgal carbon cycle. Seaweed blue carbon has been proposed as a substantial contributor to marine carbon sequestration </w:t>
-      </w:r>
-      <w:r>
-        <w:rPr>
-          <w:rFonts w:ascii="Times New Roman" w:hAnsi="Times New Roman" w:cs="Times New Roman"/>
-        </w:rPr>
-        <w:fldChar w:fldCharType="begin"/>
-      </w:r>
-      <w:r>
-        <w:rPr>
-          <w:rFonts w:ascii="Times New Roman" w:hAnsi="Times New Roman" w:cs="Times New Roman"/>
-        </w:rPr>
-        <w:instrText>ADDIN BEC{Krause-Jensen and Duarte, 2016 #82158; Pessarrodona et al., 2023 #24777; Filbee-Dexter et al., 2024 #27978}</w:instrText>
-      </w:r>
-      <w:r>
-        <w:rPr>
-          <w:rFonts w:ascii="Times New Roman" w:hAnsi="Times New Roman" w:cs="Times New Roman"/>
-        </w:rPr>
-        <w:fldChar w:fldCharType="separate"/>
-      </w:r>
-      <w:r>
-        <w:rPr>
-          <w:rFonts w:ascii="Times New Roman" w:hAnsi="Times New Roman" w:cs="Times New Roman"/>
-        </w:rPr>
-        <w:t>(Krause-Jensen &amp; Duarte 2016, Pessarrodona et al. 2023, Filbee-Dexter et al. 2024)</w:t>
-      </w:r>
-      <w:r>
-        <w:rPr>
-          <w:rFonts w:ascii="Times New Roman" w:hAnsi="Times New Roman" w:cs="Times New Roman"/>
-        </w:rPr>
-        <w:fldChar w:fldCharType="end"/>
-      </w:r>
-      <w:r>
-        <w:rPr>
-          <w:rFonts w:ascii="Times New Roman" w:hAnsi="Times New Roman" w:cs="Times New Roman"/>
-        </w:rPr>
-        <w:t xml:space="preserve">. Each proposed sequestration pathway </w:t>
-      </w:r>
-      <w:r>
-        <w:rPr>
-          <w:rFonts w:ascii="Times New Roman" w:hAnsi="Times New Roman" w:cs="Times New Roman"/>
-        </w:rPr>
-        <w:fldChar w:fldCharType="begin"/>
-      </w:r>
-      <w:r>
-        <w:rPr>
-          <w:rFonts w:ascii="Times New Roman" w:hAnsi="Times New Roman" w:cs="Times New Roman"/>
-        </w:rPr>
-        <w:instrText>ADDIN BEC{Pessarrodona et al., 2023 #24777}</w:instrText>
-      </w:r>
-      <w:r>
-        <w:rPr>
-          <w:rFonts w:ascii="Times New Roman" w:hAnsi="Times New Roman" w:cs="Times New Roman"/>
-        </w:rPr>
-        <w:fldChar w:fldCharType="separate"/>
-      </w:r>
-      <w:r>
-        <w:rPr>
-          <w:rFonts w:ascii="Times New Roman" w:hAnsi="Times New Roman" w:cs="Times New Roman"/>
-        </w:rPr>
-        <w:t>(Pessarrodona et al. 2023)</w:t>
-      </w:r>
-      <w:r>
-        <w:rPr>
-          <w:rFonts w:ascii="Times New Roman" w:hAnsi="Times New Roman" w:cs="Times New Roman"/>
-        </w:rPr>
-        <w:fldChar w:fldCharType="end"/>
-      </w:r>
-      <w:r>
-        <w:rPr>
-          <w:rFonts w:ascii="Times New Roman" w:hAnsi="Times New Roman" w:cs="Times New Roman"/>
-        </w:rPr>
-        <w:t xml:space="preserve"> naturally hinges on decomposition. Even sequestration estimates based on deep ocean retention which does not discriminate between organic and inorganic carbon are affected by decomposition </w:t>
-      </w:r>
-      <w:r>
-        <w:rPr>
-          <w:rFonts w:ascii="Times New Roman" w:hAnsi="Times New Roman" w:cs="Times New Roman"/>
-        </w:rPr>
-        <w:fldChar w:fldCharType="begin"/>
-      </w:r>
-      <w:r>
-        <w:rPr>
-          <w:rFonts w:ascii="Times New Roman" w:hAnsi="Times New Roman" w:cs="Times New Roman"/>
-        </w:rPr>
-        <w:instrText>ADDIN BEC{Simpkins et al., 2025 #59214; van der Mheen et al., 2024 #3369; Filbee-Dexter et al., 2024 #27978; White and Norkko, 2025 #37663}</w:instrText>
-      </w:r>
-      <w:r>
-        <w:rPr>
-          <w:rFonts w:ascii="Times New Roman" w:hAnsi="Times New Roman" w:cs="Times New Roman"/>
-        </w:rPr>
-        <w:fldChar w:fldCharType="separate"/>
-      </w:r>
-      <w:r>
-        <w:rPr>
-          <w:rFonts w:ascii="Times New Roman" w:hAnsi="Times New Roman" w:cs="Times New Roman"/>
-        </w:rPr>
-        <w:t>(Filbee-Dexter et al. 2024, van der Mheen et al. 2024, Simpkins et al. 2025, White &amp; Norkko 2025)</w:t>
-      </w:r>
-      <w:r>
-        <w:rPr>
-          <w:rFonts w:ascii="Times New Roman" w:hAnsi="Times New Roman" w:cs="Times New Roman"/>
-        </w:rPr>
-        <w:fldChar w:fldCharType="end"/>
-      </w:r>
-      <w:r>
-        <w:rPr>
-          <w:rFonts w:ascii="Times New Roman" w:hAnsi="Times New Roman" w:cs="Times New Roman"/>
-        </w:rPr>
-        <w:t xml:space="preserve">. I have previously suggested that detrital photosynthesis is an important determinant of kelp decomposition </w:t>
-      </w:r>
-      <w:r>
-        <w:rPr>
-          <w:rFonts w:ascii="Times New Roman" w:hAnsi="Times New Roman" w:cs="Times New Roman"/>
-        </w:rPr>
-        <w:fldChar w:fldCharType="begin"/>
-      </w:r>
-      <w:r>
-        <w:rPr>
-          <w:rFonts w:ascii="Times New Roman" w:hAnsi="Times New Roman" w:cs="Times New Roman"/>
-        </w:rPr>
-        <w:instrText>ADDIN BEC{Wright et al., 2022 #84779; Wright et al., 2024 #11375}</w:instrText>
-      </w:r>
-      <w:r>
-        <w:rPr>
-          <w:rFonts w:ascii="Times New Roman" w:hAnsi="Times New Roman" w:cs="Times New Roman"/>
-        </w:rPr>
-        <w:fldChar w:fldCharType="separate"/>
-      </w:r>
-      <w:r>
-        <w:rPr>
-          <w:rFonts w:ascii="Times New Roman" w:hAnsi="Times New Roman" w:cs="Times New Roman"/>
-        </w:rPr>
-        <w:t>(Wright et al. 2022, 2024)</w:t>
-      </w:r>
-      <w:r>
-        <w:rPr>
-          <w:rFonts w:ascii="Times New Roman" w:hAnsi="Times New Roman" w:cs="Times New Roman"/>
-        </w:rPr>
-        <w:fldChar w:fldCharType="end"/>
-      </w:r>
-      <w:r>
-        <w:rPr>
-          <w:rFonts w:ascii="Times New Roman" w:hAnsi="Times New Roman" w:cs="Times New Roman"/>
-        </w:rPr>
-        <w:t xml:space="preserve"> and have here shown this effect to be unique to macroalgae. The key implication is that seaweed decomposition is not comparable to that of other plants. Due to enormous physiological variation in seaweed detritus, as shown here, it is even hard to compare decomposition within seaweeds when not explicitly accounting for detrital photosynthesis </w:t>
-      </w:r>
-      <w:r>
-        <w:rPr>
-          <w:rFonts w:ascii="Times New Roman" w:hAnsi="Times New Roman" w:cs="Times New Roman"/>
-        </w:rPr>
-        <w:fldChar w:fldCharType="begin"/>
-      </w:r>
-      <w:r>
-        <w:rPr>
-          <w:rFonts w:ascii="Times New Roman" w:hAnsi="Times New Roman" w:cs="Times New Roman"/>
-        </w:rPr>
-        <w:instrText>ADDIN BEC{Wright et al., 2022 #84779; Kennedy and Blain, 2025 #108523; White and Norkko, 2025 #37663}</w:instrText>
-      </w:r>
-      <w:r>
-        <w:rPr>
-          <w:rFonts w:ascii="Times New Roman" w:hAnsi="Times New Roman" w:cs="Times New Roman"/>
-        </w:rPr>
-        <w:fldChar w:fldCharType="separate"/>
-      </w:r>
-      <w:r>
-        <w:rPr>
-          <w:rFonts w:ascii="Times New Roman" w:hAnsi="Times New Roman" w:cs="Times New Roman"/>
-        </w:rPr>
-        <w:t>(Wright et al. 2022, Kennedy &amp; Blain 2025, White &amp; Norkko 2025)</w:t>
-      </w:r>
-      <w:r>
-        <w:rPr>
-          <w:rFonts w:ascii="Times New Roman" w:hAnsi="Times New Roman" w:cs="Times New Roman"/>
-        </w:rPr>
-        <w:fldChar w:fldCharType="end"/>
-      </w:r>
-      <w:r>
-        <w:rPr>
-          <w:rFonts w:ascii="Times New Roman" w:hAnsi="Times New Roman" w:cs="Times New Roman"/>
-        </w:rPr>
-        <w:t xml:space="preserve">. Most of our understanding of seaweed decomposition is based on freshly excised blades </w:t>
-      </w:r>
-      <w:r>
-        <w:rPr>
-          <w:rFonts w:ascii="Times New Roman" w:hAnsi="Times New Roman" w:cs="Times New Roman"/>
-        </w:rPr>
-        <w:fldChar w:fldCharType="begin"/>
-      </w:r>
-      <w:r>
-        <w:rPr>
-          <w:rFonts w:ascii="Times New Roman" w:hAnsi="Times New Roman" w:cs="Times New Roman"/>
-        </w:rPr>
-        <w:instrText>ADDIN BEC{Frontier et al., 2021 #5570; Frontier et al., 2022 #81381; Wright et al., 2022 #84779; Filbee-Dexter et al., 2022 #89942; Kennedy and Blain, 2025 #108523; White and Norkko, 2025 #37663}</w:instrText>
-      </w:r>
-      <w:r>
-        <w:rPr>
-          <w:rFonts w:ascii="Times New Roman" w:hAnsi="Times New Roman" w:cs="Times New Roman"/>
-        </w:rPr>
-        <w:fldChar w:fldCharType="separate"/>
-      </w:r>
-      <w:r>
-        <w:rPr>
-          <w:rFonts w:ascii="Times New Roman" w:hAnsi="Times New Roman" w:cs="Times New Roman"/>
-        </w:rPr>
-        <w:t>(Frontier et al. 2021, Filbee-Dexter et al. 2022, Frontier et al. 2022, Wright et al. 2022, Kennedy &amp; Blain 2025, White &amp; Norkko 2025)</w:t>
-      </w:r>
-      <w:r>
-        <w:rPr>
-          <w:rFonts w:ascii="Times New Roman" w:hAnsi="Times New Roman" w:cs="Times New Roman"/>
-        </w:rPr>
-        <w:fldChar w:fldCharType="end"/>
-      </w:r>
-      <w:r>
-        <w:rPr>
-          <w:rFonts w:ascii="Times New Roman" w:hAnsi="Times New Roman" w:cs="Times New Roman"/>
-        </w:rPr>
-        <w:t xml:space="preserve"> as opposed to senescent fronds </w:t>
-      </w:r>
-      <w:r>
-        <w:rPr>
-          <w:rFonts w:ascii="Times New Roman" w:hAnsi="Times New Roman" w:cs="Times New Roman"/>
-        </w:rPr>
-        <w:fldChar w:fldCharType="begin"/>
-      </w:r>
-      <w:r>
-        <w:rPr>
-          <w:rFonts w:ascii="Times New Roman" w:hAnsi="Times New Roman" w:cs="Times New Roman"/>
-        </w:rPr>
-        <w:instrText>ADDIN BEC{Hamersley et al., 2015 #100188; de Bettignies et al., 2020 #27484}</w:instrText>
-      </w:r>
-      <w:r>
-        <w:rPr>
-          <w:rFonts w:ascii="Times New Roman" w:hAnsi="Times New Roman" w:cs="Times New Roman"/>
-        </w:rPr>
-        <w:fldChar w:fldCharType="separate"/>
-      </w:r>
-      <w:r>
-        <w:rPr>
-          <w:rFonts w:ascii="Times New Roman" w:hAnsi="Times New Roman" w:cs="Times New Roman"/>
-        </w:rPr>
-        <w:t>(Hamersley et al. 2015, de Bettignies et al. 2020)</w:t>
-      </w:r>
-      <w:r>
-        <w:rPr>
-          <w:rFonts w:ascii="Times New Roman" w:hAnsi="Times New Roman" w:cs="Times New Roman"/>
-        </w:rPr>
-        <w:fldChar w:fldCharType="end"/>
-      </w:r>
-      <w:r>
-        <w:rPr>
-          <w:rFonts w:ascii="Times New Roman" w:hAnsi="Times New Roman" w:cs="Times New Roman"/>
-        </w:rPr>
-        <w:t xml:space="preserve"> or dead tissue </w:t>
-      </w:r>
-      <w:r>
-        <w:rPr>
-          <w:rFonts w:ascii="Times New Roman" w:hAnsi="Times New Roman" w:cs="Times New Roman"/>
-        </w:rPr>
-        <w:fldChar w:fldCharType="begin"/>
-      </w:r>
-      <w:r>
-        <w:rPr>
-          <w:rFonts w:ascii="Times New Roman" w:hAnsi="Times New Roman" w:cs="Times New Roman"/>
-        </w:rPr>
-        <w:instrText>ADDIN BEC{Josselyn and Mathieson, 1980 #46927; Rice and Tenore, 1981 #62280; Birch et al., 1983 #5321; Smith and Foreman, 1984 #41137; Brouwer, 1996 #26706}</w:instrText>
-      </w:r>
-      <w:r>
-        <w:rPr>
-          <w:rFonts w:ascii="Times New Roman" w:hAnsi="Times New Roman" w:cs="Times New Roman"/>
-        </w:rPr>
-        <w:fldChar w:fldCharType="separate"/>
-      </w:r>
-      <w:r>
-        <w:rPr>
-          <w:rFonts w:ascii="Times New Roman" w:hAnsi="Times New Roman" w:cs="Times New Roman"/>
-        </w:rPr>
-        <w:t>(Josselyn &amp; Mathieson 1980, Rice &amp; Tenore 1981, Birch et al. 1983, Smith &amp; Foreman 1984, Brouwer 1996)</w:t>
-      </w:r>
-      <w:r>
-        <w:rPr>
-          <w:rFonts w:ascii="Times New Roman" w:hAnsi="Times New Roman" w:cs="Times New Roman"/>
-        </w:rPr>
-        <w:fldChar w:fldCharType="end"/>
-      </w:r>
-      <w:r>
-        <w:rPr>
-          <w:rFonts w:ascii="Times New Roman" w:hAnsi="Times New Roman" w:cs="Times New Roman"/>
-        </w:rPr>
-        <w:t xml:space="preserve">. But as mentioned, only around 26% of seaweed detritus can be considered fully viable when exported. Additionally, decomposition experiments are usually carried out in mesocosms or the shallow subtidal with access to light, but seaweed carbon sinks are often said to be found in the darkness of the deep sea </w:t>
-      </w:r>
-      <w:r>
-        <w:rPr>
-          <w:rFonts w:ascii="Times New Roman" w:hAnsi="Times New Roman" w:cs="Times New Roman"/>
-        </w:rPr>
-        <w:fldChar w:fldCharType="begin"/>
-      </w:r>
-      <w:r>
-        <w:rPr>
-          <w:rFonts w:ascii="Times New Roman" w:hAnsi="Times New Roman" w:cs="Times New Roman"/>
-        </w:rPr>
-        <w:instrText>ADDIN BEC{Krause-Jensen and Duarte, 2016 #82158; Filbee-Dexter et al., 2024 #27978; Simpkins et al., 2025 #59214; van der Mheen et al., 2024 #3369; Krumhansl et al., 2025 #20399}</w:instrText>
-      </w:r>
-      <w:r>
-        <w:rPr>
-          <w:rFonts w:ascii="Times New Roman" w:hAnsi="Times New Roman" w:cs="Times New Roman"/>
-        </w:rPr>
-        <w:fldChar w:fldCharType="separate"/>
-      </w:r>
-      <w:r>
-        <w:rPr>
-          <w:rFonts w:ascii="Times New Roman" w:hAnsi="Times New Roman" w:cs="Times New Roman"/>
-        </w:rPr>
-        <w:t>(Krause-Jensen &amp; Duarte 2016, Filbee-Dexter et al. 2024, van der Mheen et al. 2024, Krumhansl et al. 2025, Simpkins et al. 2025)</w:t>
-      </w:r>
-      <w:r>
-        <w:rPr>
-          <w:rFonts w:ascii="Times New Roman" w:hAnsi="Times New Roman" w:cs="Times New Roman"/>
-        </w:rPr>
-        <w:fldChar w:fldCharType="end"/>
-      </w:r>
-      <w:r>
-        <w:rPr>
-          <w:rFonts w:ascii="Times New Roman" w:hAnsi="Times New Roman" w:cs="Times New Roman"/>
-        </w:rPr>
-        <w:t>. My meta-analysis suggests that darkness has a detrimental effect on the detrital photosynthesis of seaweeds, thus accelerating their decomposition. Perhaps it is time to question existing preconceptions in macroalgal blue carbon.</w:t>
-      </w:r>
-    </w:p>
-    <w:p>
-      <w:pPr>
-        <w:spacing w:line="360" w:lineRule="auto"/>
-        <w:rPr>
-          <w:rFonts w:ascii="Times New Roman" w:hAnsi="Times New Roman" w:cs="Times New Roman"/>
-        </w:rPr>
-      </w:pPr>
-    </w:p>
-    <w:p>
-      <w:pPr>
-        <w:spacing w:line="360" w:lineRule="auto"/>
-        <w:rPr>
-          <w:rFonts w:ascii="Times New Roman" w:hAnsi="Times New Roman" w:cs="Times New Roman"/>
-        </w:rPr>
-      </w:pPr>
-      <w:r>
-        <w:rPr>
-          <w:rFonts w:ascii="Times New Roman" w:hAnsi="Times New Roman" w:cs="Times New Roman"/>
-        </w:rPr>
-        <w:t xml:space="preserve">To conclude, I show that all plants may photosynthesise following detachment, but timescales vary greatly from a few minutes in tree leaves without access to water to a year for certain seaweeds. Only macroalgal detrital photosynthesis decays on similar timescales to detrital mass. Physiology is therefore expected to determine the decomposition of macroalgae, a relationship which is unique among plants. Predictors of photosynthesis, such as temperature and light, can </w:t>
-      </w:r>
-      <w:r>
-        <w:rPr>
-          <w:rFonts w:ascii="Times New Roman" w:hAnsi="Times New Roman" w:cs="Times New Roman"/>
-        </w:rPr>
-        <w:lastRenderedPageBreak/>
-        <w:t xml:space="preserve">hence be used to predict macroalgal decomposition. With the theory of detrital photosynthesis formalised, we now need (1) empirical data on underrepresented plants such as seagrasses and Rhodophyta, (2) a model of macroalgal decomposition that takes into account this theory, (3) seagrass and seaweed decomposition experiments comparing live and dead detritus to directly investigate the proposed effect of physiology on decomposition (cf. </w:t>
+        <w:t xml:space="preserve">seaweeds. Only macroalgal detrital photosynthesis decays on similar timescales to detrital mass. Physiology is therefore expected to determine the decomposition of macroalgae, a relationship which is unique among plants. Predictors of photosynthesis, such as temperature and light, can hence be used to predict macroalgal decomposition. With the theory of detrital photosynthesis formalised, we now need (1) empirical data on underrepresented plants such as seagrasses and Rhodophyta, (2) a model of macroalgal decomposition that takes into account this theory, (3) seagrass and seaweed decomposition experiments comparing live and dead detritus to directly investigate the proposed effect of physiology on decomposition (cf. </w:t>
       </w:r>
       <w:r>
         <w:rPr>
@@ -15411,7 +16180,6 @@
         <w:rPr>
           <w:rFonts w:ascii="Times New Roman" w:hAnsi="Times New Roman" w:cs="Times New Roman"/>
         </w:rPr>
-        <w:lastRenderedPageBreak/>
         <w:fldChar w:fldCharType="begin"/>
       </w:r>
       <w:r>

</xml_diff>